<commit_message>
feat(ui): adiciona imagens de fundo e fixa cabecalho no topo
</commit_message>
<xml_diff>
--- a/src/reports/relatorio_1.docx
+++ b/src/reports/relatorio_1.docx
@@ -5625,6 +5625,63 @@
           </w:p>
         </w:tc>
       </w:tr>
+      <w:tr>
+        <w:tc>
+          <w:tcPr>
+            <w:tcW w:type="dxa" w:w="8222"/>
+            <w:gridSpan w:val="4"/>
+            <w:shd w:val="clear" w:color="auto" w:fill="D9D9D9"/>
+            <w:tcMar>
+              <w:top w:w="100" w:type="dxa"/>
+              <w:bottom w:w="100" w:type="dxa"/>
+              <w:left w:w="150" w:type="dxa"/>
+              <w:right w:w="150" w:type="dxa"/>
+            </w:tcMar>
+            <w:vAlign w:val="center"/>
+          </w:tcPr>
+          <w:p>
+            <w:pPr>
+              <w:spacing w:before="0" w:after="0" w:line="240" w:lineRule="auto"/>
+              <w:jc w:val="center"/>
+            </w:pPr>
+            <w:r>
+              <w:rPr>
+                <w:rFonts w:ascii="Aptos" w:hAnsi="Aptos"/>
+                <w:b/>
+                <w:sz w:val="20"/>
+              </w:rPr>
+              <w:t>TOTAL</w:t>
+            </w:r>
+          </w:p>
+        </w:tc>
+        <w:tc>
+          <w:tcPr>
+            <w:tcW w:type="dxa" w:w="2246"/>
+            <w:shd w:val="clear" w:color="auto" w:fill="D9D9D9"/>
+            <w:tcMar>
+              <w:top w:w="100" w:type="dxa"/>
+              <w:bottom w:w="100" w:type="dxa"/>
+              <w:left w:w="150" w:type="dxa"/>
+              <w:right w:w="150" w:type="dxa"/>
+            </w:tcMar>
+            <w:vAlign w:val="center"/>
+          </w:tcPr>
+          <w:p>
+            <w:pPr>
+              <w:spacing w:before="0" w:after="0" w:line="240" w:lineRule="auto"/>
+              <w:jc w:val="center"/>
+            </w:pPr>
+            <w:r>
+              <w:rPr>
+                <w:rFonts w:ascii="Aptos" w:hAnsi="Aptos"/>
+                <w:b/>
+                <w:sz w:val="20"/>
+              </w:rPr>
+              <w:t>1</w:t>
+            </w:r>
+          </w:p>
+        </w:tc>
+      </w:tr>
     </w:tbl>
     <w:p/>
     <w:p>

</xml_diff>

<commit_message>
feat: adiciona metadados aos relatorios e aprimora responsividade da ui
</commit_message>
<xml_diff>
--- a/src/reports/relatorio_1.docx
+++ b/src/reports/relatorio_1.docx
@@ -178,7 +178,7 @@
           <w:b/>
           <w:sz w:val="24"/>
         </w:rPr>
-        <w:t>SEI Nº xxxxxxxxxxxx/2025-XX</w:t>
+        <w:t>SEI Nº xxxxxxxx-xxx</w:t>
       </w:r>
     </w:p>
     <w:p>
@@ -1097,7 +1097,7 @@
                 <w:b/>
                 <w:sz w:val="22"/>
               </w:rPr>
-              <w:t>APÊNDICE ÚNICO  – REGISTROS FOTOGRÁFICOS DAS NÃO CONFORMIDADES</w:t>
+              <w:t>APÊNDICE ÚNICO - MEMORIAL FOTOGRÁFICO - FISCALIZAÇÃO</w:t>
             </w:r>
             <w:r>
               <w:tab/>
@@ -1219,7 +1219,7 @@
           <w:color w:val="FF0000"/>
           <w:sz w:val="22"/>
         </w:rPr>
-        <w:t>302 (Doc. SEI 75605952)</w:t>
+        <w:t>xxx (Doc. SEI nº xxxxxxxx-xxx)</w:t>
       </w:r>
       <w:r>
         <w:rPr>
@@ -1308,7 +1308,7 @@
           <w:p>
             <w:pPr>
               <w:spacing w:before="80" w:after="80"/>
-              <w:jc w:val="center"/>
+              <w:jc w:val="left"/>
             </w:pPr>
             <w:r>
               <w:rPr>
@@ -1488,7 +1488,7 @@
           <w:p>
             <w:pPr>
               <w:spacing w:before="80" w:after="80"/>
-              <w:jc w:val="center"/>
+              <w:jc w:val="left"/>
             </w:pPr>
             <w:r>
               <w:rPr>
@@ -1668,7 +1668,7 @@
           <w:p>
             <w:pPr>
               <w:spacing w:before="80" w:after="80"/>
-              <w:jc w:val="center"/>
+              <w:jc w:val="left"/>
             </w:pPr>
             <w:r>
               <w:rPr>
@@ -1848,7 +1848,7 @@
           <w:p>
             <w:pPr>
               <w:spacing w:before="80" w:after="80"/>
-              <w:jc w:val="center"/>
+              <w:jc w:val="left"/>
             </w:pPr>
             <w:r>
               <w:rPr>
@@ -5573,7 +5573,7 @@
                 <w:rFonts w:ascii="Aptos" w:hAnsi="Aptos"/>
                 <w:sz w:val="20"/>
               </w:rPr>
-              <w:t>Fotos 1.1, 1.2, 1.3, 1.4, 1.5, 1.6, 1.7, 1.8, 1.9 e 2.0</w:t>
+              <w:t>Fotos 1.1, 1.2, 1.3, 1.4, 1.5, 1.6, 1.7, 1.8, 1.9 e 02</w:t>
             </w:r>
           </w:p>
         </w:tc>
@@ -5685,39 +5685,6 @@
       </w:tr>
     </w:tbl>
     <w:p/>
-    <w:p>
-      <w:pPr>
-        <w:spacing w:after="120"/>
-        <w:jc w:val="center"/>
-      </w:pPr>
-      <w:r>
-        <w:rPr>
-          <w:rFonts w:ascii="Aptos" w:hAnsi="Aptos"/>
-          <w:b/>
-          <w:sz w:val="22"/>
-        </w:rPr>
-        <w:t>Quadro 3</w:t>
-      </w:r>
-      <w:r>
-        <w:rPr>
-          <w:rFonts w:ascii="Aptos" w:hAnsi="Aptos"/>
-          <w:sz w:val="22"/>
-        </w:rPr>
-        <w:t xml:space="preserve"> – Pontos de Atenção por Rodovia/Sentido</w:t>
-      </w:r>
-    </w:p>
-    <w:p>
-      <w:pPr>
-        <w:jc w:val="center"/>
-      </w:pPr>
-      <w:r>
-        <w:rPr>
-          <w:rFonts w:ascii="Aptos" w:hAnsi="Aptos"/>
-          <w:sz w:val="20"/>
-        </w:rPr>
-        <w:t>Nenhum registro encontrado.</w:t>
-      </w:r>
-    </w:p>
     <w:p/>
     <w:p/>
     <w:p/>
@@ -5901,412 +5868,6 @@
         <w:t>Recomenda-se, por fim, o encaminhamento deste Relatório de Fiscalização para que Suape, na qualidade de Gestor do Contrato e Regulador desse Sistema Viário, realize as providências cabíveis junto à Concessionária Rota do Atlântico com o objetivo de garantir a regularização das Não Conformidades pendentes apontadas por esta Agência de Regulação.</w:t>
       </w:r>
     </w:p>
-    <w:p>
-      <w:pPr>
-        <w:pStyle w:val="Heading3"/>
-        <w:pageBreakBefore/>
-        <w:spacing w:before="160" w:after="80"/>
-      </w:pPr>
-      <w:r>
-        <w:rPr>
-          <w:rFonts w:ascii="Aptos" w:hAnsi="Aptos"/>
-          <w:b/>
-          <w:color w:val="000000"/>
-          <w:sz w:val="24"/>
-        </w:rPr>
-        <w:t>APÊNDICE A – REGISTROS FOTOGRÁFICOS DAS NÃO CONFORMIDADES</w:t>
-      </w:r>
-    </w:p>
-    <w:tbl>
-      <w:tblPr>
-        <w:tblStyle w:val="TableGrid"/>
-        <w:tblW w:type="auto" w:w="0"/>
-        <w:jc w:val="center"/>
-        <w:tblLayout w:type="fixed"/>
-        <w:tblLook w:firstColumn="1" w:firstRow="1" w:lastColumn="0" w:lastRow="0" w:noHBand="0" w:noVBand="1" w:val="04A0"/>
-      </w:tblPr>
-      <w:tblGrid>
-        <w:gridCol w:w="5234"/>
-        <w:gridCol w:w="5234"/>
-      </w:tblGrid>
-      <w:tr>
-        <w:tc>
-          <w:tcPr>
-            <w:tcW w:type="dxa" w:w="10469"/>
-            <w:gridSpan w:val="2"/>
-          </w:tcPr>
-          <w:p>
-            <w:pPr>
-              <w:spacing w:before="120" w:after="120"/>
-              <w:jc w:val="center"/>
-            </w:pPr>
-            <w:r>
-              <w:rPr>
-                <w:rFonts w:ascii="Aptos" w:hAnsi="Aptos"/>
-                <w:b/>
-                <w:sz w:val="22"/>
-              </w:rPr>
-              <w:t>Terminal Rodoviário do Recife - TIP, Pista sentido Única</w:t>
-            </w:r>
-          </w:p>
-        </w:tc>
-      </w:tr>
-      <w:tr>
-        <w:tc>
-          <w:tcPr>
-            <w:tcW w:type="dxa" w:w="5234"/>
-          </w:tcPr>
-          <w:p>
-            <w:pPr>
-              <w:spacing w:before="80" w:after="80"/>
-              <w:ind w:left="0" w:firstLine="0"/>
-              <w:jc w:val="center"/>
-            </w:pPr>
-          </w:p>
-        </w:tc>
-        <w:tc>
-          <w:tcPr>
-            <w:tcW w:type="dxa" w:w="5234"/>
-          </w:tcPr>
-          <w:p>
-            <w:pPr>
-              <w:spacing w:before="80" w:after="80"/>
-              <w:ind w:left="0" w:firstLine="0"/>
-              <w:jc w:val="center"/>
-            </w:pPr>
-          </w:p>
-        </w:tc>
-      </w:tr>
-      <w:tr>
-        <w:tc>
-          <w:tcPr>
-            <w:tcW w:type="dxa" w:w="5234"/>
-          </w:tcPr>
-          <w:p>
-            <w:pPr>
-              <w:spacing w:before="80" w:after="80"/>
-              <w:ind w:left="0" w:firstLine="0"/>
-              <w:jc w:val="both"/>
-            </w:pPr>
-            <w:r>
-              <w:rPr>
-                <w:rFonts w:ascii="Aptos" w:hAnsi="Aptos"/>
-                <w:sz w:val="20"/>
-              </w:rPr>
-              <w:t>Foto 1.1 – Infiltração em coluna de sustentação do Terminal do recife, (08/06/2025).</w:t>
-            </w:r>
-          </w:p>
-        </w:tc>
-        <w:tc>
-          <w:tcPr>
-            <w:tcW w:type="dxa" w:w="5234"/>
-          </w:tcPr>
-          <w:p>
-            <w:pPr>
-              <w:spacing w:before="80" w:after="80"/>
-              <w:ind w:left="0" w:firstLine="0"/>
-              <w:jc w:val="both"/>
-            </w:pPr>
-            <w:r>
-              <w:rPr>
-                <w:rFonts w:ascii="Aptos" w:hAnsi="Aptos"/>
-                <w:sz w:val="20"/>
-              </w:rPr>
-              <w:t>Foto 1.2 – Infiltração em coluna de sustentação do Terminal do recife, (08/06/2025).</w:t>
-            </w:r>
-          </w:p>
-        </w:tc>
-      </w:tr>
-      <w:tr>
-        <w:tc>
-          <w:tcPr>
-            <w:tcW w:type="dxa" w:w="5234"/>
-          </w:tcPr>
-          <w:p>
-            <w:pPr>
-              <w:spacing w:before="80" w:after="80"/>
-              <w:ind w:left="0" w:firstLine="0"/>
-              <w:jc w:val="center"/>
-            </w:pPr>
-          </w:p>
-        </w:tc>
-        <w:tc>
-          <w:tcPr>
-            <w:tcW w:type="dxa" w:w="5234"/>
-          </w:tcPr>
-          <w:p>
-            <w:pPr>
-              <w:spacing w:before="80" w:after="80"/>
-              <w:ind w:left="0" w:firstLine="0"/>
-              <w:jc w:val="center"/>
-            </w:pPr>
-          </w:p>
-        </w:tc>
-      </w:tr>
-      <w:tr>
-        <w:tc>
-          <w:tcPr>
-            <w:tcW w:type="dxa" w:w="5234"/>
-          </w:tcPr>
-          <w:p>
-            <w:pPr>
-              <w:spacing w:before="80" w:after="80"/>
-              <w:ind w:left="0" w:firstLine="0"/>
-              <w:jc w:val="both"/>
-            </w:pPr>
-            <w:r>
-              <w:rPr>
-                <w:rFonts w:ascii="Aptos" w:hAnsi="Aptos"/>
-                <w:sz w:val="20"/>
-              </w:rPr>
-              <w:t>Foto 1.3 – Infiltração em coluna de sustentação do Terminal do recife, (08/06/2025).</w:t>
-            </w:r>
-          </w:p>
-        </w:tc>
-        <w:tc>
-          <w:tcPr>
-            <w:tcW w:type="dxa" w:w="5234"/>
-          </w:tcPr>
-          <w:p>
-            <w:pPr>
-              <w:spacing w:before="80" w:after="80"/>
-              <w:ind w:left="0" w:firstLine="0"/>
-              <w:jc w:val="both"/>
-            </w:pPr>
-            <w:r>
-              <w:rPr>
-                <w:rFonts w:ascii="Aptos" w:hAnsi="Aptos"/>
-                <w:sz w:val="20"/>
-              </w:rPr>
-              <w:t>Foto 1.4 – Infiltração em coluna de sustentação do Terminal do recife, (08/06/2025).</w:t>
-            </w:r>
-          </w:p>
-        </w:tc>
-      </w:tr>
-      <w:tr>
-        <w:tc>
-          <w:tcPr>
-            <w:tcW w:type="dxa" w:w="5234"/>
-          </w:tcPr>
-          <w:p>
-            <w:pPr>
-              <w:spacing w:before="80" w:after="80"/>
-              <w:ind w:left="0" w:firstLine="0"/>
-              <w:jc w:val="center"/>
-            </w:pPr>
-          </w:p>
-        </w:tc>
-        <w:tc>
-          <w:tcPr>
-            <w:tcW w:type="dxa" w:w="5234"/>
-          </w:tcPr>
-          <w:p>
-            <w:pPr>
-              <w:spacing w:before="80" w:after="80"/>
-              <w:ind w:left="0" w:firstLine="0"/>
-              <w:jc w:val="center"/>
-            </w:pPr>
-          </w:p>
-        </w:tc>
-      </w:tr>
-      <w:tr>
-        <w:tc>
-          <w:tcPr>
-            <w:tcW w:type="dxa" w:w="5234"/>
-          </w:tcPr>
-          <w:p>
-            <w:pPr>
-              <w:spacing w:before="80" w:after="80"/>
-              <w:ind w:left="0" w:firstLine="0"/>
-              <w:jc w:val="both"/>
-            </w:pPr>
-            <w:r>
-              <w:rPr>
-                <w:rFonts w:ascii="Aptos" w:hAnsi="Aptos"/>
-                <w:sz w:val="20"/>
-              </w:rPr>
-              <w:t>Foto 1.5 – Infiltração em coluna de sustentação do Terminal do recife, (08/06/2025).</w:t>
-            </w:r>
-          </w:p>
-        </w:tc>
-        <w:tc>
-          <w:tcPr>
-            <w:tcW w:type="dxa" w:w="5234"/>
-          </w:tcPr>
-          <w:p>
-            <w:pPr>
-              <w:spacing w:before="80" w:after="80"/>
-              <w:ind w:left="0" w:firstLine="0"/>
-              <w:jc w:val="both"/>
-            </w:pPr>
-            <w:r>
-              <w:rPr>
-                <w:rFonts w:ascii="Aptos" w:hAnsi="Aptos"/>
-                <w:sz w:val="20"/>
-              </w:rPr>
-              <w:t>Foto 1.6 – Infiltração em coluna de sustentação do Terminal do recife, (08/06/2025).</w:t>
-            </w:r>
-          </w:p>
-        </w:tc>
-      </w:tr>
-      <w:tr>
-        <w:tc>
-          <w:tcPr>
-            <w:tcW w:type="dxa" w:w="5234"/>
-          </w:tcPr>
-          <w:p>
-            <w:pPr>
-              <w:spacing w:before="80" w:after="80"/>
-              <w:ind w:left="0" w:firstLine="0"/>
-              <w:jc w:val="center"/>
-            </w:pPr>
-          </w:p>
-        </w:tc>
-        <w:tc>
-          <w:tcPr>
-            <w:tcW w:type="dxa" w:w="5234"/>
-          </w:tcPr>
-          <w:p>
-            <w:pPr>
-              <w:spacing w:before="80" w:after="80"/>
-              <w:ind w:left="0" w:firstLine="0"/>
-              <w:jc w:val="center"/>
-            </w:pPr>
-          </w:p>
-        </w:tc>
-      </w:tr>
-      <w:tr>
-        <w:tc>
-          <w:tcPr>
-            <w:tcW w:type="dxa" w:w="5234"/>
-          </w:tcPr>
-          <w:p>
-            <w:pPr>
-              <w:spacing w:before="80" w:after="80"/>
-              <w:ind w:left="0" w:firstLine="0"/>
-              <w:jc w:val="both"/>
-            </w:pPr>
-            <w:r>
-              <w:rPr>
-                <w:rFonts w:ascii="Aptos" w:hAnsi="Aptos"/>
-                <w:sz w:val="20"/>
-              </w:rPr>
-              <w:t>Foto 1.7 – Infiltração em coluna de sustentação do Terminal do recife, (08/06/2025).</w:t>
-            </w:r>
-          </w:p>
-        </w:tc>
-        <w:tc>
-          <w:tcPr>
-            <w:tcW w:type="dxa" w:w="5234"/>
-          </w:tcPr>
-          <w:p>
-            <w:pPr>
-              <w:spacing w:before="80" w:after="80"/>
-              <w:ind w:left="0" w:firstLine="0"/>
-              <w:jc w:val="both"/>
-            </w:pPr>
-            <w:r>
-              <w:rPr>
-                <w:rFonts w:ascii="Aptos" w:hAnsi="Aptos"/>
-                <w:sz w:val="20"/>
-              </w:rPr>
-              <w:t>Foto 1.8 – Infiltração em coluna de sustentação do Terminal do recife, (08/06/2025).</w:t>
-            </w:r>
-          </w:p>
-        </w:tc>
-      </w:tr>
-      <w:tr>
-        <w:tc>
-          <w:tcPr>
-            <w:tcW w:type="dxa" w:w="5234"/>
-          </w:tcPr>
-          <w:p>
-            <w:pPr>
-              <w:spacing w:before="80" w:after="80"/>
-              <w:ind w:left="0" w:firstLine="0"/>
-              <w:jc w:val="center"/>
-            </w:pPr>
-          </w:p>
-        </w:tc>
-        <w:tc>
-          <w:tcPr>
-            <w:tcW w:type="dxa" w:w="5234"/>
-          </w:tcPr>
-          <w:p>
-            <w:pPr>
-              <w:spacing w:before="80" w:after="80"/>
-              <w:ind w:left="0" w:firstLine="0"/>
-              <w:jc w:val="center"/>
-            </w:pPr>
-          </w:p>
-        </w:tc>
-      </w:tr>
-      <w:tr>
-        <w:tc>
-          <w:tcPr>
-            <w:tcW w:type="dxa" w:w="5234"/>
-          </w:tcPr>
-          <w:p>
-            <w:pPr>
-              <w:spacing w:before="80" w:after="80"/>
-              <w:ind w:left="0" w:firstLine="0"/>
-              <w:jc w:val="both"/>
-            </w:pPr>
-            <w:r>
-              <w:rPr>
-                <w:rFonts w:ascii="Aptos" w:hAnsi="Aptos"/>
-                <w:sz w:val="20"/>
-              </w:rPr>
-              <w:t>Foto 1.9 – Infiltração em coluna de sustentação do Terminal do recife, (08/06/2025).</w:t>
-            </w:r>
-          </w:p>
-        </w:tc>
-        <w:tc>
-          <w:tcPr>
-            <w:tcW w:type="dxa" w:w="5234"/>
-          </w:tcPr>
-          <w:p>
-            <w:pPr>
-              <w:spacing w:before="80" w:after="80"/>
-              <w:ind w:left="0" w:firstLine="0"/>
-              <w:jc w:val="both"/>
-            </w:pPr>
-            <w:r>
-              <w:rPr>
-                <w:rFonts w:ascii="Aptos" w:hAnsi="Aptos"/>
-                <w:sz w:val="20"/>
-              </w:rPr>
-              <w:t>Foto 2.0 – Infiltração em coluna de sustentação do Terminal do recife, (08/06/2025).</w:t>
-            </w:r>
-          </w:p>
-        </w:tc>
-      </w:tr>
-    </w:tbl>
-    <w:p>
-      <w:pPr>
-        <w:pStyle w:val="Heading3"/>
-        <w:pageBreakBefore/>
-        <w:spacing w:before="160" w:after="80"/>
-      </w:pPr>
-      <w:r>
-        <w:rPr>
-          <w:rFonts w:ascii="Aptos" w:hAnsi="Aptos"/>
-          <w:b/>
-          <w:color w:val="000000"/>
-          <w:sz w:val="24"/>
-        </w:rPr>
-        <w:t>APÊNDICE B – REGISTROS FOTOGRÁFICOS DAS PONTOS DE ATENÇÃO</w:t>
-      </w:r>
-    </w:p>
-    <w:p>
-      <w:r>
-        <w:rPr>
-          <w:rFonts w:ascii="Aptos" w:hAnsi="Aptos"/>
-          <w:sz w:val="22"/>
-        </w:rPr>
-        <w:t>Nenhum registro fotográfico de ponto de atenção cadastrado.</w:t>
-      </w:r>
-    </w:p>
     <w:p/>
     <w:p>
       <w:pPr>
@@ -6457,6 +6018,360 @@
         <w:t>Matrícula nº 209640/01</w:t>
       </w:r>
     </w:p>
+    <w:p>
+      <w:pPr>
+        <w:pStyle w:val="Heading3"/>
+        <w:pageBreakBefore/>
+        <w:spacing w:before="160" w:after="80"/>
+      </w:pPr>
+      <w:r>
+        <w:rPr>
+          <w:rFonts w:ascii="Aptos" w:hAnsi="Aptos"/>
+          <w:b/>
+          <w:color w:val="000000"/>
+          <w:sz w:val="24"/>
+        </w:rPr>
+        <w:t>APÊNDICE ÚNICO - MEMORIAL FOTOGRÁFICO - FISCALIZAÇÃO</w:t>
+      </w:r>
+    </w:p>
+    <w:p>
+      <w:pPr>
+        <w:spacing w:before="240" w:after="120" w:line="276" w:lineRule="auto"/>
+        <w:jc w:val="both"/>
+      </w:pPr>
+      <w:r>
+        <w:rPr>
+          <w:rFonts w:ascii="Aptos" w:hAnsi="Aptos"/>
+          <w:b/>
+          <w:sz w:val="22"/>
+        </w:rPr>
+        <w:t>Trecho Não Informado</w:t>
+      </w:r>
+    </w:p>
+    <w:tbl>
+      <w:tblPr>
+        <w:tblStyle w:val="TableGrid"/>
+        <w:tblW w:type="auto" w:w="0"/>
+        <w:jc w:val="center"/>
+        <w:tblLayout w:type="fixed"/>
+        <w:tblLook w:firstColumn="1" w:firstRow="1" w:lastColumn="0" w:lastRow="0" w:noHBand="0" w:noVBand="1" w:val="04A0"/>
+      </w:tblPr>
+      <w:tblGrid>
+        <w:gridCol w:w="5234"/>
+        <w:gridCol w:w="5234"/>
+      </w:tblGrid>
+      <w:tr>
+        <w:tc>
+          <w:tcPr>
+            <w:tcW w:type="dxa" w:w="5234"/>
+          </w:tcPr>
+          <w:p>
+            <w:pPr>
+              <w:spacing w:before="80" w:after="80"/>
+              <w:jc w:val="center"/>
+            </w:pPr>
+          </w:p>
+        </w:tc>
+        <w:tc>
+          <w:tcPr>
+            <w:tcW w:type="dxa" w:w="5234"/>
+          </w:tcPr>
+          <w:p>
+            <w:pPr>
+              <w:spacing w:before="80" w:after="80"/>
+              <w:jc w:val="center"/>
+            </w:pPr>
+          </w:p>
+        </w:tc>
+      </w:tr>
+      <w:tr>
+        <w:tc>
+          <w:tcPr>
+            <w:tcW w:type="dxa" w:w="5234"/>
+          </w:tcPr>
+          <w:p>
+            <w:pPr>
+              <w:spacing w:before="80" w:after="80"/>
+              <w:jc w:val="both"/>
+            </w:pPr>
+            <w:r>
+              <w:rPr>
+                <w:rFonts w:ascii="Aptos" w:hAnsi="Aptos"/>
+                <w:sz w:val="20"/>
+              </w:rPr>
+              <w:t>Foto 1.1 – Infiltração em coluna de sustentação do Terminal do recife, em 08/06/2025.</w:t>
+            </w:r>
+          </w:p>
+        </w:tc>
+        <w:tc>
+          <w:tcPr>
+            <w:tcW w:type="dxa" w:w="5234"/>
+          </w:tcPr>
+          <w:p>
+            <w:pPr>
+              <w:spacing w:before="80" w:after="80"/>
+              <w:jc w:val="both"/>
+            </w:pPr>
+            <w:r>
+              <w:rPr>
+                <w:rFonts w:ascii="Aptos" w:hAnsi="Aptos"/>
+                <w:sz w:val="20"/>
+              </w:rPr>
+              <w:t>Foto 1.2 – Infiltração em coluna de sustentação do Terminal do recife, em 08/06/2025.</w:t>
+            </w:r>
+          </w:p>
+        </w:tc>
+      </w:tr>
+      <w:tr>
+        <w:tc>
+          <w:tcPr>
+            <w:tcW w:type="dxa" w:w="5234"/>
+          </w:tcPr>
+          <w:p>
+            <w:pPr>
+              <w:spacing w:before="80" w:after="80"/>
+              <w:jc w:val="center"/>
+            </w:pPr>
+          </w:p>
+        </w:tc>
+        <w:tc>
+          <w:tcPr>
+            <w:tcW w:type="dxa" w:w="5234"/>
+          </w:tcPr>
+          <w:p>
+            <w:pPr>
+              <w:spacing w:before="80" w:after="80"/>
+              <w:jc w:val="center"/>
+            </w:pPr>
+          </w:p>
+        </w:tc>
+      </w:tr>
+      <w:tr>
+        <w:tc>
+          <w:tcPr>
+            <w:tcW w:type="dxa" w:w="5234"/>
+          </w:tcPr>
+          <w:p>
+            <w:pPr>
+              <w:spacing w:before="80" w:after="80"/>
+              <w:jc w:val="both"/>
+            </w:pPr>
+            <w:r>
+              <w:rPr>
+                <w:rFonts w:ascii="Aptos" w:hAnsi="Aptos"/>
+                <w:sz w:val="20"/>
+              </w:rPr>
+              <w:t>Foto 1.3 – Infiltração em coluna de sustentação do Terminal do recife, em 08/06/2025.</w:t>
+            </w:r>
+          </w:p>
+        </w:tc>
+        <w:tc>
+          <w:tcPr>
+            <w:tcW w:type="dxa" w:w="5234"/>
+          </w:tcPr>
+          <w:p>
+            <w:pPr>
+              <w:spacing w:before="80" w:after="80"/>
+              <w:jc w:val="both"/>
+            </w:pPr>
+            <w:r>
+              <w:rPr>
+                <w:rFonts w:ascii="Aptos" w:hAnsi="Aptos"/>
+                <w:sz w:val="20"/>
+              </w:rPr>
+              <w:t>Foto 1.4 – Infiltração em coluna de sustentação do Terminal do recife, em 08/06/2025.</w:t>
+            </w:r>
+          </w:p>
+        </w:tc>
+      </w:tr>
+      <w:tr>
+        <w:tc>
+          <w:tcPr>
+            <w:tcW w:type="dxa" w:w="5234"/>
+          </w:tcPr>
+          <w:p>
+            <w:pPr>
+              <w:spacing w:before="80" w:after="80"/>
+              <w:jc w:val="center"/>
+            </w:pPr>
+          </w:p>
+        </w:tc>
+        <w:tc>
+          <w:tcPr>
+            <w:tcW w:type="dxa" w:w="5234"/>
+          </w:tcPr>
+          <w:p>
+            <w:pPr>
+              <w:spacing w:before="80" w:after="80"/>
+              <w:jc w:val="center"/>
+            </w:pPr>
+          </w:p>
+        </w:tc>
+      </w:tr>
+      <w:tr>
+        <w:tc>
+          <w:tcPr>
+            <w:tcW w:type="dxa" w:w="5234"/>
+          </w:tcPr>
+          <w:p>
+            <w:pPr>
+              <w:spacing w:before="80" w:after="80"/>
+              <w:jc w:val="both"/>
+            </w:pPr>
+            <w:r>
+              <w:rPr>
+                <w:rFonts w:ascii="Aptos" w:hAnsi="Aptos"/>
+                <w:sz w:val="20"/>
+              </w:rPr>
+              <w:t>Foto 1.5 – Infiltração em coluna de sustentação do Terminal do recife, em 08/06/2025.</w:t>
+            </w:r>
+          </w:p>
+        </w:tc>
+        <w:tc>
+          <w:tcPr>
+            <w:tcW w:type="dxa" w:w="5234"/>
+          </w:tcPr>
+          <w:p>
+            <w:pPr>
+              <w:spacing w:before="80" w:after="80"/>
+              <w:jc w:val="both"/>
+            </w:pPr>
+            <w:r>
+              <w:rPr>
+                <w:rFonts w:ascii="Aptos" w:hAnsi="Aptos"/>
+                <w:sz w:val="20"/>
+              </w:rPr>
+              <w:t>Foto 1.6 – Infiltração em coluna de sustentação do Terminal do recife, em 08/06/2025.</w:t>
+            </w:r>
+          </w:p>
+        </w:tc>
+      </w:tr>
+      <w:tr>
+        <w:tc>
+          <w:tcPr>
+            <w:tcW w:type="dxa" w:w="5234"/>
+          </w:tcPr>
+          <w:p>
+            <w:pPr>
+              <w:spacing w:before="80" w:after="80"/>
+              <w:jc w:val="center"/>
+            </w:pPr>
+          </w:p>
+        </w:tc>
+        <w:tc>
+          <w:tcPr>
+            <w:tcW w:type="dxa" w:w="5234"/>
+          </w:tcPr>
+          <w:p>
+            <w:pPr>
+              <w:spacing w:before="80" w:after="80"/>
+              <w:jc w:val="center"/>
+            </w:pPr>
+          </w:p>
+        </w:tc>
+      </w:tr>
+      <w:tr>
+        <w:tc>
+          <w:tcPr>
+            <w:tcW w:type="dxa" w:w="5234"/>
+          </w:tcPr>
+          <w:p>
+            <w:pPr>
+              <w:spacing w:before="80" w:after="80"/>
+              <w:jc w:val="both"/>
+            </w:pPr>
+            <w:r>
+              <w:rPr>
+                <w:rFonts w:ascii="Aptos" w:hAnsi="Aptos"/>
+                <w:sz w:val="20"/>
+              </w:rPr>
+              <w:t>Foto 1.7 – Infiltração em coluna de sustentação do Terminal do recife, em 08/06/2025.</w:t>
+            </w:r>
+          </w:p>
+        </w:tc>
+        <w:tc>
+          <w:tcPr>
+            <w:tcW w:type="dxa" w:w="5234"/>
+          </w:tcPr>
+          <w:p>
+            <w:pPr>
+              <w:spacing w:before="80" w:after="80"/>
+              <w:jc w:val="both"/>
+            </w:pPr>
+            <w:r>
+              <w:rPr>
+                <w:rFonts w:ascii="Aptos" w:hAnsi="Aptos"/>
+                <w:sz w:val="20"/>
+              </w:rPr>
+              <w:t>Foto 1.8 – Infiltração em coluna de sustentação do Terminal do recife, em 08/06/2025.</w:t>
+            </w:r>
+          </w:p>
+        </w:tc>
+      </w:tr>
+      <w:tr>
+        <w:tc>
+          <w:tcPr>
+            <w:tcW w:type="dxa" w:w="5234"/>
+          </w:tcPr>
+          <w:p>
+            <w:pPr>
+              <w:spacing w:before="80" w:after="80"/>
+              <w:jc w:val="center"/>
+            </w:pPr>
+          </w:p>
+        </w:tc>
+        <w:tc>
+          <w:tcPr>
+            <w:tcW w:type="dxa" w:w="5234"/>
+          </w:tcPr>
+          <w:p>
+            <w:pPr>
+              <w:spacing w:before="80" w:after="80"/>
+              <w:jc w:val="center"/>
+            </w:pPr>
+          </w:p>
+        </w:tc>
+      </w:tr>
+      <w:tr>
+        <w:tc>
+          <w:tcPr>
+            <w:tcW w:type="dxa" w:w="5234"/>
+          </w:tcPr>
+          <w:p>
+            <w:pPr>
+              <w:spacing w:before="80" w:after="80"/>
+              <w:jc w:val="both"/>
+            </w:pPr>
+            <w:r>
+              <w:rPr>
+                <w:rFonts w:ascii="Aptos" w:hAnsi="Aptos"/>
+                <w:sz w:val="20"/>
+              </w:rPr>
+              <w:t>Foto 1.9 – Infiltração em coluna de sustentação do Terminal do recife, em 08/06/2025.</w:t>
+            </w:r>
+          </w:p>
+        </w:tc>
+        <w:tc>
+          <w:tcPr>
+            <w:tcW w:type="dxa" w:w="5234"/>
+          </w:tcPr>
+          <w:p>
+            <w:pPr>
+              <w:spacing w:before="80" w:after="80"/>
+              <w:jc w:val="both"/>
+            </w:pPr>
+            <w:r>
+              <w:rPr>
+                <w:rFonts w:ascii="Aptos" w:hAnsi="Aptos"/>
+                <w:sz w:val="20"/>
+              </w:rPr>
+              <w:t>Foto 2.0 – Infiltração em coluna de sustentação do Terminal do recife, em 08/06/2025.</w:t>
+            </w:r>
+          </w:p>
+        </w:tc>
+      </w:tr>
+    </w:tbl>
+    <w:p/>
     <w:sectPr>
       <w:pgSz w:w="11909" w:h="16834"/>
       <w:pgMar w:top="720" w:right="720" w:bottom="720" w:left="720" w:header="720" w:footer="720" w:gutter="0"/>

</xml_diff>

<commit_message>
feat(ui): implementar tema cromático dinâmico para os 6 estados e melhorias de UX
</commit_message>
<xml_diff>
--- a/src/reports/relatorio_1.docx
+++ b/src/reports/relatorio_1.docx
@@ -178,7 +178,7 @@
           <w:b/>
           <w:sz w:val="24"/>
         </w:rPr>
-        <w:t>SEI Nº xxxxxxxxxxxx/2025-XX</w:t>
+        <w:t>SEI Nº xxxxxxxx-xxx</w:t>
       </w:r>
     </w:p>
     <w:p>
@@ -1097,7 +1097,7 @@
                 <w:b/>
                 <w:sz w:val="22"/>
               </w:rPr>
-              <w:t>APÊNDICE ÚNICO  – REGISTROS FOTOGRÁFICOS DAS NÃO CONFORMIDADES</w:t>
+              <w:t>APÊNDICE ÚNICO - MEMORIAL FOTOGRÁFICO - FISCALIZAÇÃO</w:t>
             </w:r>
             <w:r>
               <w:tab/>
@@ -1219,7 +1219,7 @@
           <w:color w:val="FF0000"/>
           <w:sz w:val="22"/>
         </w:rPr>
-        <w:t>302 (Doc. SEI 75605952)</w:t>
+        <w:t>xxx (Doc. SEI nº xxxxxxxx-xxx)</w:t>
       </w:r>
       <w:r>
         <w:rPr>
@@ -1308,7 +1308,7 @@
           <w:p>
             <w:pPr>
               <w:spacing w:before="80" w:after="80"/>
-              <w:jc w:val="center"/>
+              <w:jc w:val="left"/>
             </w:pPr>
             <w:r>
               <w:rPr>
@@ -1488,7 +1488,7 @@
           <w:p>
             <w:pPr>
               <w:spacing w:before="80" w:after="80"/>
-              <w:jc w:val="center"/>
+              <w:jc w:val="left"/>
             </w:pPr>
             <w:r>
               <w:rPr>
@@ -1668,7 +1668,7 @@
           <w:p>
             <w:pPr>
               <w:spacing w:before="80" w:after="80"/>
-              <w:jc w:val="center"/>
+              <w:jc w:val="left"/>
             </w:pPr>
             <w:r>
               <w:rPr>
@@ -1848,7 +1848,7 @@
           <w:p>
             <w:pPr>
               <w:spacing w:before="80" w:after="80"/>
-              <w:jc w:val="center"/>
+              <w:jc w:val="left"/>
             </w:pPr>
             <w:r>
               <w:rPr>
@@ -2689,2562 +2689,14 @@
     </w:p>
     <w:p>
       <w:pPr>
-        <w:spacing w:before="240" w:after="120"/>
-        <w:jc w:val="center"/>
-      </w:pPr>
-      <w:r>
-        <w:rPr>
-          <w:rFonts w:ascii="Aptos" w:hAnsi="Aptos"/>
-          <w:b/>
-          <w:sz w:val="22"/>
-        </w:rPr>
-        <w:t>Quadro 1</w:t>
-      </w:r>
-      <w:r>
-        <w:rPr>
-          <w:rFonts w:ascii="Aptos" w:hAnsi="Aptos"/>
-          <w:sz w:val="22"/>
-        </w:rPr>
-        <w:t xml:space="preserve"> – Demonstrativo da Elegibilidade do Trecho Fiscalizado para Indicação de NC</w:t>
-      </w:r>
-    </w:p>
-    <w:tbl>
-      <w:tblPr>
-        <w:tblStyle w:val="TableGrid"/>
-        <w:tblW w:type="auto" w:w="0"/>
-        <w:jc w:val="center"/>
-        <w:tblLook w:firstColumn="1" w:firstRow="1" w:lastColumn="0" w:lastRow="0" w:noHBand="0" w:noVBand="1" w:val="04A0"/>
-      </w:tblPr>
-      <w:tblGrid>
-        <w:gridCol w:w="2617"/>
-        <w:gridCol w:w="2617"/>
-        <w:gridCol w:w="2617"/>
-        <w:gridCol w:w="2617"/>
-      </w:tblGrid>
-      <w:tr>
-        <w:tc>
-          <w:tcPr>
-            <w:tcW w:type="dxa" w:w="2592"/>
-            <w:shd w:fill="DDDDDD"/>
-          </w:tcPr>
-          <w:p>
-            <w:pPr>
-              <w:jc w:val="center"/>
-            </w:pPr>
-            <w:r>
-              <w:rPr>
-                <w:rFonts w:ascii="Aptos" w:hAnsi="Aptos"/>
-                <w:b/>
-                <w:sz w:val="20"/>
-              </w:rPr>
-              <w:t>TRECHO ELEGÍVEL</w:t>
-              <w:br/>
-              <w:t>(KMinicial-KMfinal)</w:t>
-            </w:r>
-          </w:p>
-        </w:tc>
-        <w:tc>
-          <w:tcPr>
-            <w:tcW w:type="dxa" w:w="1584"/>
-            <w:shd w:fill="DDDDDD"/>
-          </w:tcPr>
-          <w:p>
-            <w:pPr>
-              <w:jc w:val="center"/>
-            </w:pPr>
-            <w:r>
-              <w:rPr>
-                <w:rFonts w:ascii="Aptos" w:hAnsi="Aptos"/>
-                <w:b/>
-                <w:sz w:val="20"/>
-              </w:rPr>
-              <w:t>SUBTRECHO</w:t>
-            </w:r>
-          </w:p>
-        </w:tc>
-        <w:tc>
-          <w:tcPr>
-            <w:tcW w:type="dxa" w:w="2736"/>
-            <w:shd w:fill="DDDDDD"/>
-          </w:tcPr>
-          <w:p>
-            <w:pPr>
-              <w:jc w:val="center"/>
-            </w:pPr>
-            <w:r>
-              <w:rPr>
-                <w:rFonts w:ascii="Aptos" w:hAnsi="Aptos"/>
-                <w:b/>
-                <w:sz w:val="20"/>
-              </w:rPr>
-              <w:t>IGG</w:t>
-              <w:br/>
-              <w:t>(Relatório Anual 01/2025)</w:t>
-            </w:r>
-          </w:p>
-        </w:tc>
-        <w:tc>
-          <w:tcPr>
-            <w:tcW w:type="dxa" w:w="2736"/>
-            <w:shd w:fill="DDDDDD"/>
-          </w:tcPr>
-          <w:p>
-            <w:pPr>
-              <w:jc w:val="center"/>
-            </w:pPr>
-            <w:r>
-              <w:rPr>
-                <w:rFonts w:ascii="Aptos" w:hAnsi="Aptos"/>
-                <w:b/>
-                <w:sz w:val="20"/>
-              </w:rPr>
-              <w:t>IRI</w:t>
-              <w:br/>
-              <w:t>(Relatório Anual 01/2025)</w:t>
-            </w:r>
-          </w:p>
-        </w:tc>
-      </w:tr>
-      <w:tr>
-        <w:tc>
-          <w:tcPr>
-            <w:tcW w:type="dxa" w:w="2736"/>
-            <w:gridSpan w:val="4"/>
-            <w:shd w:fill="FFFFCC"/>
-          </w:tcPr>
-          <w:p>
-            <w:pPr>
-              <w:jc w:val="left"/>
-            </w:pPr>
-            <w:r>
-              <w:rPr>
-                <w:rFonts w:ascii="Aptos" w:hAnsi="Aptos"/>
-                <w:b w:val="0"/>
-                <w:sz w:val="20"/>
-              </w:rPr>
-              <w:t>PE - 009, PISTA SENTIDO SUL (CRESCENTE)</w:t>
-            </w:r>
-          </w:p>
-        </w:tc>
-      </w:tr>
-      <w:tr>
-        <w:tc>
-          <w:tcPr>
-            <w:tcW w:type="dxa" w:w="2592"/>
-          </w:tcPr>
-          <w:p>
-            <w:pPr>
-              <w:jc w:val="center"/>
-            </w:pPr>
-            <w:r>
-              <w:rPr>
-                <w:rFonts w:ascii="Aptos" w:hAnsi="Aptos"/>
-                <w:b w:val="0"/>
-                <w:sz w:val="20"/>
-              </w:rPr>
-              <w:t>29,08 - 29,14</w:t>
-            </w:r>
-          </w:p>
-        </w:tc>
-        <w:tc>
-          <w:tcPr>
-            <w:tcW w:type="dxa" w:w="1584"/>
-          </w:tcPr>
-          <w:p>
-            <w:pPr>
-              <w:jc w:val="center"/>
-            </w:pPr>
-            <w:r>
-              <w:rPr>
-                <w:rFonts w:ascii="Aptos" w:hAnsi="Aptos"/>
-                <w:b w:val="0"/>
-                <w:sz w:val="20"/>
-              </w:rPr>
-              <w:t>ST 6.02</w:t>
-            </w:r>
-          </w:p>
-        </w:tc>
-        <w:tc>
-          <w:tcPr>
-            <w:tcW w:type="dxa" w:w="2736"/>
-          </w:tcPr>
-          <w:p>
-            <w:pPr>
-              <w:jc w:val="center"/>
-            </w:pPr>
-            <w:r>
-              <w:rPr>
-                <w:rFonts w:ascii="Aptos" w:hAnsi="Aptos"/>
-                <w:b w:val="0"/>
-                <w:sz w:val="20"/>
-              </w:rPr>
-              <w:t>49,29</w:t>
-              <w:br/>
-              <w:t>(página 285)</w:t>
-            </w:r>
-          </w:p>
-        </w:tc>
-        <w:tc>
-          <w:tcPr>
-            <w:tcW w:type="dxa" w:w="2736"/>
-          </w:tcPr>
-          <w:p>
-            <w:pPr>
-              <w:jc w:val="center"/>
-            </w:pPr>
-            <w:r>
-              <w:rPr>
-                <w:rFonts w:ascii="Aptos" w:hAnsi="Aptos"/>
-                <w:b w:val="0"/>
-                <w:sz w:val="20"/>
-              </w:rPr>
-              <w:t>FD 4,16</w:t>
-              <w:br/>
-              <w:t>(página 125)</w:t>
-            </w:r>
-          </w:p>
-        </w:tc>
-      </w:tr>
-      <w:tr>
-        <w:tc>
-          <w:tcPr>
-            <w:tcW w:type="dxa" w:w="2592"/>
-          </w:tcPr>
-          <w:p>
-            <w:pPr>
-              <w:jc w:val="center"/>
-            </w:pPr>
-            <w:r>
-              <w:rPr>
-                <w:rFonts w:ascii="Aptos" w:hAnsi="Aptos"/>
-                <w:b w:val="0"/>
-                <w:sz w:val="20"/>
-              </w:rPr>
-              <w:t>33,88-33,90</w:t>
-            </w:r>
-          </w:p>
-        </w:tc>
-        <w:tc>
-          <w:tcPr>
-            <w:tcW w:type="dxa" w:w="1584"/>
-          </w:tcPr>
-          <w:p>
-            <w:pPr>
-              <w:jc w:val="center"/>
-            </w:pPr>
-            <w:r>
-              <w:rPr>
-                <w:rFonts w:ascii="Aptos" w:hAnsi="Aptos"/>
-                <w:b w:val="0"/>
-                <w:sz w:val="20"/>
-              </w:rPr>
-              <w:t>ST 6.06</w:t>
-            </w:r>
-          </w:p>
-        </w:tc>
-        <w:tc>
-          <w:tcPr>
-            <w:tcW w:type="dxa" w:w="2736"/>
-          </w:tcPr>
-          <w:p>
-            <w:pPr>
-              <w:jc w:val="center"/>
-            </w:pPr>
-            <w:r>
-              <w:rPr>
-                <w:rFonts w:ascii="Aptos" w:hAnsi="Aptos"/>
-                <w:b w:val="0"/>
-                <w:sz w:val="20"/>
-              </w:rPr>
-              <w:t>47,02</w:t>
-              <w:br/>
-              <w:t>(página 296)</w:t>
-            </w:r>
-          </w:p>
-        </w:tc>
-        <w:tc>
-          <w:tcPr>
-            <w:tcW w:type="dxa" w:w="2736"/>
-          </w:tcPr>
-          <w:p>
-            <w:pPr>
-              <w:jc w:val="center"/>
-            </w:pPr>
-            <w:r>
-              <w:rPr>
-                <w:rFonts w:ascii="Aptos" w:hAnsi="Aptos"/>
-                <w:b w:val="0"/>
-                <w:sz w:val="20"/>
-              </w:rPr>
-              <w:t>FD 3,58</w:t>
-              <w:br/>
-              <w:t>(página 125)</w:t>
-            </w:r>
-          </w:p>
-        </w:tc>
-      </w:tr>
-      <w:tr>
-        <w:tc>
-          <w:tcPr>
-            <w:tcW w:type="dxa" w:w="2592"/>
-          </w:tcPr>
-          <w:p>
-            <w:pPr>
-              <w:jc w:val="center"/>
-            </w:pPr>
-            <w:r>
-              <w:rPr>
-                <w:rFonts w:ascii="Aptos" w:hAnsi="Aptos"/>
-                <w:b w:val="0"/>
-                <w:sz w:val="20"/>
-              </w:rPr>
-              <w:t>34,00-34,02</w:t>
-            </w:r>
-          </w:p>
-        </w:tc>
-        <w:tc>
-          <w:tcPr>
-            <w:tcW w:type="dxa" w:w="1584"/>
-          </w:tcPr>
-          <w:p>
-            <w:pPr>
-              <w:jc w:val="center"/>
-            </w:pPr>
-            <w:r>
-              <w:rPr>
-                <w:rFonts w:ascii="Aptos" w:hAnsi="Aptos"/>
-                <w:b w:val="0"/>
-                <w:sz w:val="20"/>
-              </w:rPr>
-              <w:t>ST 6.07</w:t>
-            </w:r>
-          </w:p>
-        </w:tc>
-        <w:tc>
-          <w:tcPr>
-            <w:tcW w:type="dxa" w:w="2736"/>
-          </w:tcPr>
-          <w:p>
-            <w:pPr>
-              <w:jc w:val="center"/>
-            </w:pPr>
-            <w:r>
-              <w:rPr>
-                <w:rFonts w:ascii="Aptos" w:hAnsi="Aptos"/>
-                <w:b w:val="0"/>
-                <w:sz w:val="20"/>
-              </w:rPr>
-              <w:t>44,60</w:t>
-              <w:br/>
-              <w:t>(página 297)</w:t>
-            </w:r>
-          </w:p>
-        </w:tc>
-        <w:tc>
-          <w:tcPr>
-            <w:tcW w:type="dxa" w:w="2736"/>
-          </w:tcPr>
-          <w:p>
-            <w:pPr>
-              <w:jc w:val="center"/>
-            </w:pPr>
-            <w:r>
-              <w:rPr>
-                <w:rFonts w:ascii="Aptos" w:hAnsi="Aptos"/>
-                <w:b w:val="0"/>
-                <w:sz w:val="20"/>
-              </w:rPr>
-              <w:t>FD 3,21</w:t>
-              <w:br/>
-              <w:t>(página 125)</w:t>
-            </w:r>
-          </w:p>
-        </w:tc>
-      </w:tr>
-      <w:tr>
-        <w:tc>
-          <w:tcPr>
-            <w:tcW w:type="dxa" w:w="2592"/>
-          </w:tcPr>
-          <w:p>
-            <w:pPr>
-              <w:jc w:val="center"/>
-            </w:pPr>
-            <w:r>
-              <w:rPr>
-                <w:rFonts w:ascii="Aptos" w:hAnsi="Aptos"/>
-                <w:b w:val="0"/>
-                <w:sz w:val="20"/>
-              </w:rPr>
-              <w:t>34,28-34,40</w:t>
-            </w:r>
-          </w:p>
-        </w:tc>
-        <w:tc>
-          <w:tcPr>
-            <w:tcW w:type="dxa" w:w="1584"/>
-          </w:tcPr>
-          <w:p>
-            <w:pPr>
-              <w:jc w:val="center"/>
-            </w:pPr>
-            <w:r>
-              <w:rPr>
-                <w:rFonts w:ascii="Aptos" w:hAnsi="Aptos"/>
-                <w:b w:val="0"/>
-                <w:sz w:val="20"/>
-              </w:rPr>
-              <w:t>ST 6.07</w:t>
-            </w:r>
-          </w:p>
-        </w:tc>
-        <w:tc>
-          <w:tcPr>
-            <w:tcW w:type="dxa" w:w="2736"/>
-          </w:tcPr>
-          <w:p>
-            <w:pPr>
-              <w:jc w:val="center"/>
-            </w:pPr>
-            <w:r>
-              <w:rPr>
-                <w:rFonts w:ascii="Aptos" w:hAnsi="Aptos"/>
-                <w:b w:val="0"/>
-                <w:sz w:val="20"/>
-              </w:rPr>
-              <w:t>44,60</w:t>
-              <w:br/>
-              <w:t>(página 297)</w:t>
-            </w:r>
-          </w:p>
-        </w:tc>
-        <w:tc>
-          <w:tcPr>
-            <w:tcW w:type="dxa" w:w="2736"/>
-          </w:tcPr>
-          <w:p>
-            <w:pPr>
-              <w:jc w:val="center"/>
-            </w:pPr>
-            <w:r>
-              <w:rPr>
-                <w:rFonts w:ascii="Aptos" w:hAnsi="Aptos"/>
-                <w:b w:val="0"/>
-                <w:sz w:val="20"/>
-              </w:rPr>
-              <w:t>FD 3,21</w:t>
-              <w:br/>
-              <w:t>(página 125)</w:t>
-            </w:r>
-          </w:p>
-        </w:tc>
-      </w:tr>
-      <w:tr>
-        <w:tc>
-          <w:tcPr>
-            <w:tcW w:type="dxa" w:w="2592"/>
-          </w:tcPr>
-          <w:p>
-            <w:pPr>
-              <w:jc w:val="center"/>
-            </w:pPr>
-            <w:r>
-              <w:rPr>
-                <w:rFonts w:ascii="Aptos" w:hAnsi="Aptos"/>
-                <w:b w:val="0"/>
-                <w:sz w:val="20"/>
-              </w:rPr>
-              <w:t>34,52-34,56</w:t>
-            </w:r>
-          </w:p>
-        </w:tc>
-        <w:tc>
-          <w:tcPr>
-            <w:tcW w:type="dxa" w:w="1584"/>
-          </w:tcPr>
-          <w:p>
-            <w:pPr>
-              <w:jc w:val="center"/>
-            </w:pPr>
-            <w:r>
-              <w:rPr>
-                <w:rFonts w:ascii="Aptos" w:hAnsi="Aptos"/>
-                <w:b w:val="0"/>
-                <w:sz w:val="20"/>
-              </w:rPr>
-              <w:t>ST 6.07</w:t>
-            </w:r>
-          </w:p>
-        </w:tc>
-        <w:tc>
-          <w:tcPr>
-            <w:tcW w:type="dxa" w:w="2736"/>
-          </w:tcPr>
-          <w:p>
-            <w:pPr>
-              <w:jc w:val="center"/>
-            </w:pPr>
-            <w:r>
-              <w:rPr>
-                <w:rFonts w:ascii="Aptos" w:hAnsi="Aptos"/>
-                <w:b w:val="0"/>
-                <w:sz w:val="20"/>
-              </w:rPr>
-              <w:t>44,60</w:t>
-              <w:br/>
-              <w:t>(página 297)</w:t>
-            </w:r>
-          </w:p>
-        </w:tc>
-        <w:tc>
-          <w:tcPr>
-            <w:tcW w:type="dxa" w:w="2736"/>
-          </w:tcPr>
-          <w:p>
-            <w:pPr>
-              <w:jc w:val="center"/>
-            </w:pPr>
-            <w:r>
-              <w:rPr>
-                <w:rFonts w:ascii="Aptos" w:hAnsi="Aptos"/>
-                <w:b w:val="0"/>
-                <w:sz w:val="20"/>
-              </w:rPr>
-              <w:t>FD 3,21</w:t>
-              <w:br/>
-              <w:t>(página 125)</w:t>
-            </w:r>
-          </w:p>
-        </w:tc>
-      </w:tr>
-      <w:tr>
-        <w:tc>
-          <w:tcPr>
-            <w:tcW w:type="dxa" w:w="2592"/>
-          </w:tcPr>
-          <w:p>
-            <w:pPr>
-              <w:jc w:val="center"/>
-            </w:pPr>
-            <w:r>
-              <w:rPr>
-                <w:rFonts w:ascii="Aptos" w:hAnsi="Aptos"/>
-                <w:b w:val="0"/>
-                <w:sz w:val="20"/>
-              </w:rPr>
-              <w:t>34,66-34,68</w:t>
-            </w:r>
-          </w:p>
-        </w:tc>
-        <w:tc>
-          <w:tcPr>
-            <w:tcW w:type="dxa" w:w="1584"/>
-          </w:tcPr>
-          <w:p>
-            <w:pPr>
-              <w:jc w:val="center"/>
-            </w:pPr>
-            <w:r>
-              <w:rPr>
-                <w:rFonts w:ascii="Aptos" w:hAnsi="Aptos"/>
-                <w:b w:val="0"/>
-                <w:sz w:val="20"/>
-              </w:rPr>
-              <w:t>ST 6.07</w:t>
-            </w:r>
-          </w:p>
-        </w:tc>
-        <w:tc>
-          <w:tcPr>
-            <w:tcW w:type="dxa" w:w="2736"/>
-          </w:tcPr>
-          <w:p>
-            <w:pPr>
-              <w:jc w:val="center"/>
-            </w:pPr>
-            <w:r>
-              <w:rPr>
-                <w:rFonts w:ascii="Aptos" w:hAnsi="Aptos"/>
-                <w:b w:val="0"/>
-                <w:sz w:val="20"/>
-              </w:rPr>
-              <w:t>44,60</w:t>
-              <w:br/>
-              <w:t>(página 297)</w:t>
-            </w:r>
-          </w:p>
-        </w:tc>
-        <w:tc>
-          <w:tcPr>
-            <w:tcW w:type="dxa" w:w="2736"/>
-          </w:tcPr>
-          <w:p>
-            <w:pPr>
-              <w:jc w:val="center"/>
-            </w:pPr>
-            <w:r>
-              <w:rPr>
-                <w:rFonts w:ascii="Aptos" w:hAnsi="Aptos"/>
-                <w:b w:val="0"/>
-                <w:sz w:val="20"/>
-              </w:rPr>
-              <w:t>FD 3,21</w:t>
-              <w:br/>
-              <w:t>(página 125)</w:t>
-            </w:r>
-          </w:p>
-        </w:tc>
-      </w:tr>
-      <w:tr>
-        <w:tc>
-          <w:tcPr>
-            <w:tcW w:type="dxa" w:w="2592"/>
-          </w:tcPr>
-          <w:p>
-            <w:pPr>
-              <w:jc w:val="center"/>
-            </w:pPr>
-            <w:r>
-              <w:rPr>
-                <w:rFonts w:ascii="Aptos" w:hAnsi="Aptos"/>
-                <w:b w:val="0"/>
-                <w:sz w:val="20"/>
-              </w:rPr>
-              <w:t>34,72-34,74</w:t>
-            </w:r>
-          </w:p>
-        </w:tc>
-        <w:tc>
-          <w:tcPr>
-            <w:tcW w:type="dxa" w:w="1584"/>
-          </w:tcPr>
-          <w:p>
-            <w:pPr>
-              <w:jc w:val="center"/>
-            </w:pPr>
-            <w:r>
-              <w:rPr>
-                <w:rFonts w:ascii="Aptos" w:hAnsi="Aptos"/>
-                <w:b w:val="0"/>
-                <w:sz w:val="20"/>
-              </w:rPr>
-              <w:t>ST 6.07</w:t>
-            </w:r>
-          </w:p>
-        </w:tc>
-        <w:tc>
-          <w:tcPr>
-            <w:tcW w:type="dxa" w:w="2736"/>
-          </w:tcPr>
-          <w:p>
-            <w:pPr>
-              <w:jc w:val="center"/>
-            </w:pPr>
-            <w:r>
-              <w:rPr>
-                <w:rFonts w:ascii="Aptos" w:hAnsi="Aptos"/>
-                <w:b w:val="0"/>
-                <w:sz w:val="20"/>
-              </w:rPr>
-              <w:t>44,60</w:t>
-              <w:br/>
-              <w:t>(página 297)</w:t>
-            </w:r>
-          </w:p>
-        </w:tc>
-        <w:tc>
-          <w:tcPr>
-            <w:tcW w:type="dxa" w:w="2736"/>
-          </w:tcPr>
-          <w:p>
-            <w:pPr>
-              <w:jc w:val="center"/>
-            </w:pPr>
-            <w:r>
-              <w:rPr>
-                <w:rFonts w:ascii="Aptos" w:hAnsi="Aptos"/>
-                <w:b w:val="0"/>
-                <w:sz w:val="20"/>
-              </w:rPr>
-              <w:t>FD 3,21</w:t>
-              <w:br/>
-              <w:t>(página 125)</w:t>
-            </w:r>
-          </w:p>
-        </w:tc>
-      </w:tr>
-      <w:tr>
-        <w:tc>
-          <w:tcPr>
-            <w:tcW w:type="dxa" w:w="2592"/>
-          </w:tcPr>
-          <w:p>
-            <w:pPr>
-              <w:jc w:val="center"/>
-            </w:pPr>
-            <w:r>
-              <w:rPr>
-                <w:rFonts w:ascii="Aptos" w:hAnsi="Aptos"/>
-                <w:b w:val="0"/>
-                <w:sz w:val="20"/>
-              </w:rPr>
-              <w:t>36,02-36,13</w:t>
-            </w:r>
-          </w:p>
-        </w:tc>
-        <w:tc>
-          <w:tcPr>
-            <w:tcW w:type="dxa" w:w="1584"/>
-          </w:tcPr>
-          <w:p>
-            <w:pPr>
-              <w:jc w:val="center"/>
-            </w:pPr>
-            <w:r>
-              <w:rPr>
-                <w:rFonts w:ascii="Aptos" w:hAnsi="Aptos"/>
-                <w:b w:val="0"/>
-                <w:sz w:val="20"/>
-              </w:rPr>
-              <w:t>ST 4.01</w:t>
-            </w:r>
-          </w:p>
-        </w:tc>
-        <w:tc>
-          <w:tcPr>
-            <w:tcW w:type="dxa" w:w="2736"/>
-          </w:tcPr>
-          <w:p>
-            <w:pPr>
-              <w:jc w:val="center"/>
-            </w:pPr>
-            <w:r>
-              <w:rPr>
-                <w:rFonts w:ascii="Aptos" w:hAnsi="Aptos"/>
-                <w:b w:val="0"/>
-                <w:sz w:val="20"/>
-              </w:rPr>
-              <w:t>71,00</w:t>
-              <w:br/>
-              <w:t>(página 223)</w:t>
-            </w:r>
-          </w:p>
-        </w:tc>
-        <w:tc>
-          <w:tcPr>
-            <w:tcW w:type="dxa" w:w="2736"/>
-          </w:tcPr>
-          <w:p>
-            <w:pPr>
-              <w:jc w:val="center"/>
-            </w:pPr>
-            <w:r>
-              <w:rPr>
-                <w:rFonts w:ascii="Aptos" w:hAnsi="Aptos"/>
-                <w:b w:val="0"/>
-                <w:sz w:val="20"/>
-              </w:rPr>
-              <w:t>FE 3,92</w:t>
-              <w:br/>
-              <w:t>(página 125)</w:t>
-            </w:r>
-          </w:p>
-        </w:tc>
-      </w:tr>
-      <w:tr>
-        <w:tc>
-          <w:tcPr>
-            <w:tcW w:type="dxa" w:w="2592"/>
-          </w:tcPr>
-          <w:p>
-            <w:pPr>
-              <w:jc w:val="center"/>
-            </w:pPr>
-            <w:r>
-              <w:rPr>
-                <w:rFonts w:ascii="Aptos" w:hAnsi="Aptos"/>
-                <w:b w:val="0"/>
-                <w:sz w:val="20"/>
-              </w:rPr>
-              <w:t>36,18-36,32</w:t>
-            </w:r>
-          </w:p>
-        </w:tc>
-        <w:tc>
-          <w:tcPr>
-            <w:tcW w:type="dxa" w:w="1584"/>
-          </w:tcPr>
-          <w:p>
-            <w:pPr>
-              <w:jc w:val="center"/>
-            </w:pPr>
-            <w:r>
-              <w:rPr>
-                <w:rFonts w:ascii="Aptos" w:hAnsi="Aptos"/>
-                <w:b w:val="0"/>
-                <w:sz w:val="20"/>
-              </w:rPr>
-              <w:t>ST 4.01</w:t>
-            </w:r>
-          </w:p>
-        </w:tc>
-        <w:tc>
-          <w:tcPr>
-            <w:tcW w:type="dxa" w:w="2736"/>
-          </w:tcPr>
-          <w:p>
-            <w:pPr>
-              <w:jc w:val="center"/>
-            </w:pPr>
-            <w:r>
-              <w:rPr>
-                <w:rFonts w:ascii="Aptos" w:hAnsi="Aptos"/>
-                <w:b w:val="0"/>
-                <w:sz w:val="20"/>
-              </w:rPr>
-              <w:t>71,00</w:t>
-              <w:br/>
-              <w:t>(página 223)</w:t>
-            </w:r>
-          </w:p>
-        </w:tc>
-        <w:tc>
-          <w:tcPr>
-            <w:tcW w:type="dxa" w:w="2736"/>
-          </w:tcPr>
-          <w:p>
-            <w:pPr>
-              <w:jc w:val="center"/>
-            </w:pPr>
-            <w:r>
-              <w:rPr>
-                <w:rFonts w:ascii="Aptos" w:hAnsi="Aptos"/>
-                <w:b w:val="0"/>
-                <w:sz w:val="20"/>
-              </w:rPr>
-              <w:t>FE 3,92</w:t>
-              <w:br/>
-              <w:t>(página 125)</w:t>
-            </w:r>
-          </w:p>
-        </w:tc>
-      </w:tr>
-      <w:tr>
-        <w:tc>
-          <w:tcPr>
-            <w:tcW w:type="dxa" w:w="2592"/>
-          </w:tcPr>
-          <w:p>
-            <w:pPr>
-              <w:jc w:val="center"/>
-            </w:pPr>
-            <w:r>
-              <w:rPr>
-                <w:rFonts w:ascii="Aptos" w:hAnsi="Aptos"/>
-                <w:b w:val="0"/>
-                <w:sz w:val="20"/>
-              </w:rPr>
-              <w:t>36,94-36,98</w:t>
-            </w:r>
-          </w:p>
-        </w:tc>
-        <w:tc>
-          <w:tcPr>
-            <w:tcW w:type="dxa" w:w="1584"/>
-          </w:tcPr>
-          <w:p>
-            <w:pPr>
-              <w:jc w:val="center"/>
-            </w:pPr>
-            <w:r>
-              <w:rPr>
-                <w:rFonts w:ascii="Aptos" w:hAnsi="Aptos"/>
-                <w:b w:val="0"/>
-                <w:sz w:val="20"/>
-              </w:rPr>
-              <w:t>ST 4.02</w:t>
-            </w:r>
-          </w:p>
-        </w:tc>
-        <w:tc>
-          <w:tcPr>
-            <w:tcW w:type="dxa" w:w="2736"/>
-          </w:tcPr>
-          <w:p>
-            <w:pPr>
-              <w:jc w:val="center"/>
-            </w:pPr>
-            <w:r>
-              <w:rPr>
-                <w:rFonts w:ascii="Aptos" w:hAnsi="Aptos"/>
-                <w:b w:val="0"/>
-                <w:sz w:val="20"/>
-              </w:rPr>
-              <w:t>61,68</w:t>
-              <w:br/>
-              <w:t>(página 225)</w:t>
-            </w:r>
-          </w:p>
-        </w:tc>
-        <w:tc>
-          <w:tcPr>
-            <w:tcW w:type="dxa" w:w="2736"/>
-          </w:tcPr>
-          <w:p>
-            <w:pPr>
-              <w:jc w:val="center"/>
-            </w:pPr>
-            <w:r>
-              <w:rPr>
-                <w:rFonts w:ascii="Aptos" w:hAnsi="Aptos"/>
-                <w:b w:val="0"/>
-                <w:sz w:val="20"/>
-              </w:rPr>
-              <w:t>FE 4,30</w:t>
-              <w:br/>
-              <w:t>(página 125)</w:t>
-            </w:r>
-          </w:p>
-        </w:tc>
-      </w:tr>
-      <w:tr>
-        <w:tc>
-          <w:tcPr>
-            <w:tcW w:type="dxa" w:w="2592"/>
-          </w:tcPr>
-          <w:p>
-            <w:pPr>
-              <w:jc w:val="center"/>
-            </w:pPr>
-            <w:r>
-              <w:rPr>
-                <w:rFonts w:ascii="Aptos" w:hAnsi="Aptos"/>
-                <w:b w:val="0"/>
-                <w:sz w:val="20"/>
-              </w:rPr>
-              <w:t>37,00-37,10</w:t>
-            </w:r>
-          </w:p>
-        </w:tc>
-        <w:tc>
-          <w:tcPr>
-            <w:tcW w:type="dxa" w:w="1584"/>
-          </w:tcPr>
-          <w:p>
-            <w:pPr>
-              <w:jc w:val="center"/>
-            </w:pPr>
-            <w:r>
-              <w:rPr>
-                <w:rFonts w:ascii="Aptos" w:hAnsi="Aptos"/>
-                <w:b w:val="0"/>
-                <w:sz w:val="20"/>
-              </w:rPr>
-              <w:t>ST 4.02</w:t>
-            </w:r>
-          </w:p>
-        </w:tc>
-        <w:tc>
-          <w:tcPr>
-            <w:tcW w:type="dxa" w:w="2736"/>
-          </w:tcPr>
-          <w:p>
-            <w:pPr>
-              <w:jc w:val="center"/>
-            </w:pPr>
-            <w:r>
-              <w:rPr>
-                <w:rFonts w:ascii="Aptos" w:hAnsi="Aptos"/>
-                <w:b w:val="0"/>
-                <w:sz w:val="20"/>
-              </w:rPr>
-              <w:t>61,68</w:t>
-              <w:br/>
-              <w:t>(página 225)</w:t>
-            </w:r>
-          </w:p>
-        </w:tc>
-        <w:tc>
-          <w:tcPr>
-            <w:tcW w:type="dxa" w:w="2736"/>
-          </w:tcPr>
-          <w:p>
-            <w:pPr>
-              <w:jc w:val="center"/>
-            </w:pPr>
-            <w:r>
-              <w:rPr>
-                <w:rFonts w:ascii="Aptos" w:hAnsi="Aptos"/>
-                <w:b w:val="0"/>
-                <w:sz w:val="20"/>
-              </w:rPr>
-              <w:t>FE 4,30</w:t>
-              <w:br/>
-              <w:t>(página 125)</w:t>
-            </w:r>
-          </w:p>
-        </w:tc>
-      </w:tr>
-      <w:tr>
-        <w:tc>
-          <w:tcPr>
-            <w:tcW w:type="dxa" w:w="2592"/>
-          </w:tcPr>
-          <w:p>
-            <w:pPr>
-              <w:jc w:val="center"/>
-            </w:pPr>
-            <w:r>
-              <w:rPr>
-                <w:rFonts w:ascii="Aptos" w:hAnsi="Aptos"/>
-                <w:b w:val="0"/>
-                <w:sz w:val="20"/>
-              </w:rPr>
-              <w:t>37,10-37,12</w:t>
-            </w:r>
-          </w:p>
-        </w:tc>
-        <w:tc>
-          <w:tcPr>
-            <w:tcW w:type="dxa" w:w="1584"/>
-          </w:tcPr>
-          <w:p>
-            <w:pPr>
-              <w:jc w:val="center"/>
-            </w:pPr>
-            <w:r>
-              <w:rPr>
-                <w:rFonts w:ascii="Aptos" w:hAnsi="Aptos"/>
-                <w:b w:val="0"/>
-                <w:sz w:val="20"/>
-              </w:rPr>
-              <w:t>ST 4.02</w:t>
-            </w:r>
-          </w:p>
-        </w:tc>
-        <w:tc>
-          <w:tcPr>
-            <w:tcW w:type="dxa" w:w="2736"/>
-          </w:tcPr>
-          <w:p>
-            <w:pPr>
-              <w:jc w:val="center"/>
-            </w:pPr>
-            <w:r>
-              <w:rPr>
-                <w:rFonts w:ascii="Aptos" w:hAnsi="Aptos"/>
-                <w:b w:val="0"/>
-                <w:sz w:val="20"/>
-              </w:rPr>
-              <w:t>61,68</w:t>
-              <w:br/>
-              <w:t>(página 225)</w:t>
-            </w:r>
-          </w:p>
-        </w:tc>
-        <w:tc>
-          <w:tcPr>
-            <w:tcW w:type="dxa" w:w="2736"/>
-          </w:tcPr>
-          <w:p>
-            <w:pPr>
-              <w:jc w:val="center"/>
-            </w:pPr>
-            <w:r>
-              <w:rPr>
-                <w:rFonts w:ascii="Aptos" w:hAnsi="Aptos"/>
-                <w:b w:val="0"/>
-                <w:sz w:val="20"/>
-              </w:rPr>
-              <w:t>FE 4,30</w:t>
-              <w:br/>
-              <w:t>(página 125)</w:t>
-            </w:r>
-          </w:p>
-        </w:tc>
-      </w:tr>
-      <w:tr>
-        <w:tc>
-          <w:tcPr>
-            <w:tcW w:type="dxa" w:w="2592"/>
-          </w:tcPr>
-          <w:p>
-            <w:pPr>
-              <w:jc w:val="center"/>
-            </w:pPr>
-            <w:r>
-              <w:rPr>
-                <w:rFonts w:ascii="Aptos" w:hAnsi="Aptos"/>
-                <w:b w:val="0"/>
-                <w:sz w:val="20"/>
-              </w:rPr>
-              <w:t>37,38-37,38</w:t>
-            </w:r>
-          </w:p>
-        </w:tc>
-        <w:tc>
-          <w:tcPr>
-            <w:tcW w:type="dxa" w:w="1584"/>
-          </w:tcPr>
-          <w:p>
-            <w:pPr>
-              <w:jc w:val="center"/>
-            </w:pPr>
-            <w:r>
-              <w:rPr>
-                <w:rFonts w:ascii="Aptos" w:hAnsi="Aptos"/>
-                <w:b w:val="0"/>
-                <w:sz w:val="20"/>
-              </w:rPr>
-              <w:t>ST 4.02</w:t>
-            </w:r>
-          </w:p>
-        </w:tc>
-        <w:tc>
-          <w:tcPr>
-            <w:tcW w:type="dxa" w:w="2736"/>
-          </w:tcPr>
-          <w:p>
-            <w:pPr>
-              <w:jc w:val="center"/>
-            </w:pPr>
-            <w:r>
-              <w:rPr>
-                <w:rFonts w:ascii="Aptos" w:hAnsi="Aptos"/>
-                <w:b w:val="0"/>
-                <w:sz w:val="20"/>
-              </w:rPr>
-              <w:t>61,68</w:t>
-              <w:br/>
-              <w:t>(página 225)</w:t>
-            </w:r>
-          </w:p>
-        </w:tc>
-        <w:tc>
-          <w:tcPr>
-            <w:tcW w:type="dxa" w:w="2736"/>
-          </w:tcPr>
-          <w:p>
-            <w:pPr>
-              <w:jc w:val="center"/>
-            </w:pPr>
-            <w:r>
-              <w:rPr>
-                <w:rFonts w:ascii="Aptos" w:hAnsi="Aptos"/>
-                <w:b w:val="0"/>
-                <w:sz w:val="20"/>
-              </w:rPr>
-              <w:t>FE 4,30</w:t>
-              <w:br/>
-              <w:t>(página 125)</w:t>
-            </w:r>
-          </w:p>
-        </w:tc>
-      </w:tr>
-      <w:tr>
-        <w:tc>
-          <w:tcPr>
-            <w:tcW w:type="dxa" w:w="2592"/>
-          </w:tcPr>
-          <w:p>
-            <w:pPr>
-              <w:jc w:val="center"/>
-            </w:pPr>
-            <w:r>
-              <w:rPr>
-                <w:rFonts w:ascii="Aptos" w:hAnsi="Aptos"/>
-                <w:b w:val="0"/>
-                <w:sz w:val="20"/>
-              </w:rPr>
-              <w:t>37,54-37,58</w:t>
-            </w:r>
-          </w:p>
-        </w:tc>
-        <w:tc>
-          <w:tcPr>
-            <w:tcW w:type="dxa" w:w="1584"/>
-          </w:tcPr>
-          <w:p>
-            <w:pPr>
-              <w:jc w:val="center"/>
-            </w:pPr>
-            <w:r>
-              <w:rPr>
-                <w:rFonts w:ascii="Aptos" w:hAnsi="Aptos"/>
-                <w:b w:val="0"/>
-                <w:sz w:val="20"/>
-              </w:rPr>
-              <w:t>ST 4.02</w:t>
-            </w:r>
-          </w:p>
-        </w:tc>
-        <w:tc>
-          <w:tcPr>
-            <w:tcW w:type="dxa" w:w="2736"/>
-          </w:tcPr>
-          <w:p>
-            <w:pPr>
-              <w:jc w:val="center"/>
-            </w:pPr>
-            <w:r>
-              <w:rPr>
-                <w:rFonts w:ascii="Aptos" w:hAnsi="Aptos"/>
-                <w:b w:val="0"/>
-                <w:sz w:val="20"/>
-              </w:rPr>
-              <w:t>61,68</w:t>
-              <w:br/>
-              <w:t>(página 225)</w:t>
-            </w:r>
-          </w:p>
-        </w:tc>
-        <w:tc>
-          <w:tcPr>
-            <w:tcW w:type="dxa" w:w="2736"/>
-          </w:tcPr>
-          <w:p>
-            <w:pPr>
-              <w:jc w:val="center"/>
-            </w:pPr>
-            <w:r>
-              <w:rPr>
-                <w:rFonts w:ascii="Aptos" w:hAnsi="Aptos"/>
-                <w:b w:val="0"/>
-                <w:sz w:val="20"/>
-              </w:rPr>
-              <w:t>FE 4,30</w:t>
-              <w:br/>
-              <w:t>(página 125)</w:t>
-            </w:r>
-          </w:p>
-        </w:tc>
-      </w:tr>
-      <w:tr>
-        <w:tc>
-          <w:tcPr>
-            <w:tcW w:type="dxa" w:w="2592"/>
-          </w:tcPr>
-          <w:p>
-            <w:pPr>
-              <w:jc w:val="center"/>
-            </w:pPr>
-            <w:r>
-              <w:rPr>
-                <w:rFonts w:ascii="Aptos" w:hAnsi="Aptos"/>
-                <w:b w:val="0"/>
-                <w:sz w:val="20"/>
-              </w:rPr>
-              <w:t>37,62-37,66</w:t>
-            </w:r>
-          </w:p>
-        </w:tc>
-        <w:tc>
-          <w:tcPr>
-            <w:tcW w:type="dxa" w:w="1584"/>
-          </w:tcPr>
-          <w:p>
-            <w:pPr>
-              <w:jc w:val="center"/>
-            </w:pPr>
-            <w:r>
-              <w:rPr>
-                <w:rFonts w:ascii="Aptos" w:hAnsi="Aptos"/>
-                <w:b w:val="0"/>
-                <w:sz w:val="20"/>
-              </w:rPr>
-              <w:t>ST 4.03</w:t>
-            </w:r>
-          </w:p>
-        </w:tc>
-        <w:tc>
-          <w:tcPr>
-            <w:tcW w:type="dxa" w:w="2736"/>
-          </w:tcPr>
-          <w:p>
-            <w:pPr>
-              <w:jc w:val="center"/>
-            </w:pPr>
-            <w:r>
-              <w:rPr>
-                <w:rFonts w:ascii="Aptos" w:hAnsi="Aptos"/>
-                <w:b w:val="0"/>
-                <w:sz w:val="20"/>
-              </w:rPr>
-              <w:t>51,64</w:t>
-              <w:br/>
-              <w:t>(página 227)</w:t>
-            </w:r>
-          </w:p>
-        </w:tc>
-        <w:tc>
-          <w:tcPr>
-            <w:tcW w:type="dxa" w:w="2736"/>
-          </w:tcPr>
-          <w:p>
-            <w:pPr>
-              <w:jc w:val="center"/>
-            </w:pPr>
-            <w:r>
-              <w:rPr>
-                <w:rFonts w:ascii="Aptos" w:hAnsi="Aptos"/>
-                <w:b w:val="0"/>
-                <w:sz w:val="20"/>
-              </w:rPr>
-              <w:t>FD 3,22</w:t>
-              <w:br/>
-              <w:t>(página 125)</w:t>
-            </w:r>
-          </w:p>
-        </w:tc>
-      </w:tr>
-      <w:tr>
-        <w:tc>
-          <w:tcPr>
-            <w:tcW w:type="dxa" w:w="2592"/>
-          </w:tcPr>
-          <w:p>
-            <w:pPr>
-              <w:jc w:val="center"/>
-            </w:pPr>
-            <w:r>
-              <w:rPr>
-                <w:rFonts w:ascii="Aptos" w:hAnsi="Aptos"/>
-                <w:b w:val="0"/>
-                <w:sz w:val="20"/>
-              </w:rPr>
-              <w:t>38,32+38,32</w:t>
-            </w:r>
-          </w:p>
-        </w:tc>
-        <w:tc>
-          <w:tcPr>
-            <w:tcW w:type="dxa" w:w="1584"/>
-          </w:tcPr>
-          <w:p>
-            <w:pPr>
-              <w:jc w:val="center"/>
-            </w:pPr>
-            <w:r>
-              <w:rPr>
-                <w:rFonts w:ascii="Aptos" w:hAnsi="Aptos"/>
-                <w:b w:val="0"/>
-                <w:sz w:val="20"/>
-              </w:rPr>
-              <w:t>ST 4.03</w:t>
-            </w:r>
-          </w:p>
-        </w:tc>
-        <w:tc>
-          <w:tcPr>
-            <w:tcW w:type="dxa" w:w="2736"/>
-          </w:tcPr>
-          <w:p>
-            <w:pPr>
-              <w:jc w:val="center"/>
-            </w:pPr>
-            <w:r>
-              <w:rPr>
-                <w:rFonts w:ascii="Aptos" w:hAnsi="Aptos"/>
-                <w:b w:val="0"/>
-                <w:sz w:val="20"/>
-              </w:rPr>
-              <w:t>51,64</w:t>
-              <w:br/>
-              <w:t>(página 227)</w:t>
-            </w:r>
-          </w:p>
-        </w:tc>
-        <w:tc>
-          <w:tcPr>
-            <w:tcW w:type="dxa" w:w="2736"/>
-          </w:tcPr>
-          <w:p>
-            <w:pPr>
-              <w:jc w:val="center"/>
-            </w:pPr>
-            <w:r>
-              <w:rPr>
-                <w:rFonts w:ascii="Aptos" w:hAnsi="Aptos"/>
-                <w:b w:val="0"/>
-                <w:sz w:val="20"/>
-              </w:rPr>
-              <w:t>FD 3,22</w:t>
-              <w:br/>
-              <w:t>(página 125)</w:t>
-            </w:r>
-          </w:p>
-        </w:tc>
-      </w:tr>
-      <w:tr>
-        <w:tc>
-          <w:tcPr>
-            <w:tcW w:type="dxa" w:w="2592"/>
-          </w:tcPr>
-          <w:p>
-            <w:pPr>
-              <w:jc w:val="center"/>
-            </w:pPr>
-            <w:r>
-              <w:rPr>
-                <w:rFonts w:ascii="Aptos" w:hAnsi="Aptos"/>
-                <w:b w:val="0"/>
-                <w:sz w:val="20"/>
-              </w:rPr>
-              <w:t>41,16-41,22</w:t>
-            </w:r>
-          </w:p>
-        </w:tc>
-        <w:tc>
-          <w:tcPr>
-            <w:tcW w:type="dxa" w:w="1584"/>
-          </w:tcPr>
-          <w:p>
-            <w:pPr>
-              <w:jc w:val="center"/>
-            </w:pPr>
-            <w:r>
-              <w:rPr>
-                <w:rFonts w:ascii="Aptos" w:hAnsi="Aptos"/>
-                <w:b w:val="0"/>
-                <w:sz w:val="20"/>
-              </w:rPr>
-              <w:t>ST 3.01</w:t>
-            </w:r>
-          </w:p>
-        </w:tc>
-        <w:tc>
-          <w:tcPr>
-            <w:tcW w:type="dxa" w:w="2736"/>
-          </w:tcPr>
-          <w:p>
-            <w:pPr>
-              <w:jc w:val="center"/>
-            </w:pPr>
-            <w:r>
-              <w:rPr>
-                <w:rFonts w:ascii="Aptos" w:hAnsi="Aptos"/>
-                <w:b w:val="0"/>
-                <w:sz w:val="20"/>
-              </w:rPr>
-              <w:t>42,34</w:t>
-              <w:br/>
-              <w:t>(página 204)</w:t>
-            </w:r>
-          </w:p>
-        </w:tc>
-        <w:tc>
-          <w:tcPr>
-            <w:tcW w:type="dxa" w:w="2736"/>
-          </w:tcPr>
-          <w:p>
-            <w:pPr>
-              <w:jc w:val="center"/>
-            </w:pPr>
-            <w:r>
-              <w:rPr>
-                <w:rFonts w:ascii="Aptos" w:hAnsi="Aptos"/>
-                <w:b w:val="0"/>
-                <w:sz w:val="20"/>
-              </w:rPr>
-              <w:t>FD 3,00</w:t>
-              <w:br/>
-              <w:t>(página 125)</w:t>
-            </w:r>
-          </w:p>
-        </w:tc>
-      </w:tr>
-      <w:tr>
-        <w:tc>
-          <w:tcPr>
-            <w:tcW w:type="dxa" w:w="2592"/>
-          </w:tcPr>
-          <w:p>
-            <w:pPr>
-              <w:jc w:val="center"/>
-            </w:pPr>
-            <w:r>
-              <w:rPr>
-                <w:rFonts w:ascii="Aptos" w:hAnsi="Aptos"/>
-                <w:b w:val="0"/>
-                <w:sz w:val="20"/>
-              </w:rPr>
-              <w:t>41,84-41,88</w:t>
-            </w:r>
-          </w:p>
-        </w:tc>
-        <w:tc>
-          <w:tcPr>
-            <w:tcW w:type="dxa" w:w="1584"/>
-          </w:tcPr>
-          <w:p>
-            <w:pPr>
-              <w:jc w:val="center"/>
-            </w:pPr>
-            <w:r>
-              <w:rPr>
-                <w:rFonts w:ascii="Aptos" w:hAnsi="Aptos"/>
-                <w:b w:val="0"/>
-                <w:sz w:val="20"/>
-              </w:rPr>
-              <w:t>ST 3.02</w:t>
-            </w:r>
-          </w:p>
-        </w:tc>
-        <w:tc>
-          <w:tcPr>
-            <w:tcW w:type="dxa" w:w="2736"/>
-          </w:tcPr>
-          <w:p>
-            <w:pPr>
-              <w:jc w:val="center"/>
-            </w:pPr>
-            <w:r>
-              <w:rPr>
-                <w:rFonts w:ascii="Aptos" w:hAnsi="Aptos"/>
-                <w:b w:val="0"/>
-                <w:sz w:val="20"/>
-              </w:rPr>
-              <w:t>45,60</w:t>
-              <w:br/>
-              <w:t>(página 206)</w:t>
-            </w:r>
-          </w:p>
-        </w:tc>
-        <w:tc>
-          <w:tcPr>
-            <w:tcW w:type="dxa" w:w="2736"/>
-          </w:tcPr>
-          <w:p>
-            <w:pPr>
-              <w:jc w:val="center"/>
-            </w:pPr>
-            <w:r>
-              <w:rPr>
-                <w:rFonts w:ascii="Aptos" w:hAnsi="Aptos"/>
-                <w:b w:val="0"/>
-                <w:sz w:val="20"/>
-              </w:rPr>
-              <w:t>FD 2,88</w:t>
-              <w:br/>
-              <w:t>(página 125)</w:t>
-            </w:r>
-          </w:p>
-        </w:tc>
-      </w:tr>
-      <w:tr>
-        <w:tc>
-          <w:tcPr>
-            <w:tcW w:type="dxa" w:w="2736"/>
-            <w:gridSpan w:val="4"/>
-            <w:shd w:fill="FFFFCC"/>
-          </w:tcPr>
-          <w:p>
-            <w:pPr>
-              <w:jc w:val="left"/>
-            </w:pPr>
-            <w:r>
-              <w:rPr>
-                <w:rFonts w:ascii="Aptos" w:hAnsi="Aptos"/>
-                <w:b w:val="0"/>
-                <w:sz w:val="20"/>
-              </w:rPr>
-              <w:t>PE - 009, PISTA SENTIDO NORTE (DECRESCENTE)</w:t>
-            </w:r>
-          </w:p>
-        </w:tc>
-      </w:tr>
-      <w:tr>
-        <w:tc>
-          <w:tcPr>
-            <w:tcW w:type="dxa" w:w="2592"/>
-          </w:tcPr>
-          <w:p>
-            <w:pPr>
-              <w:jc w:val="center"/>
-            </w:pPr>
-            <w:r>
-              <w:rPr>
-                <w:rFonts w:ascii="Aptos" w:hAnsi="Aptos"/>
-                <w:b w:val="0"/>
-                <w:sz w:val="20"/>
-              </w:rPr>
-              <w:t>40,16-40,60</w:t>
-            </w:r>
-          </w:p>
-        </w:tc>
-        <w:tc>
-          <w:tcPr>
-            <w:tcW w:type="dxa" w:w="1584"/>
-          </w:tcPr>
-          <w:p>
-            <w:pPr>
-              <w:jc w:val="center"/>
-            </w:pPr>
-            <w:r>
-              <w:rPr>
-                <w:rFonts w:ascii="Aptos" w:hAnsi="Aptos"/>
-                <w:b w:val="0"/>
-                <w:sz w:val="20"/>
-              </w:rPr>
-              <w:t>ST 4.06</w:t>
-            </w:r>
-          </w:p>
-        </w:tc>
-        <w:tc>
-          <w:tcPr>
-            <w:tcW w:type="dxa" w:w="2736"/>
-          </w:tcPr>
-          <w:p>
-            <w:pPr>
-              <w:jc w:val="center"/>
-            </w:pPr>
-            <w:r>
-              <w:rPr>
-                <w:rFonts w:ascii="Aptos" w:hAnsi="Aptos"/>
-                <w:b w:val="0"/>
-                <w:sz w:val="20"/>
-              </w:rPr>
-              <w:t>70,36</w:t>
-              <w:br/>
-              <w:t>(página 233)</w:t>
-            </w:r>
-          </w:p>
-        </w:tc>
-        <w:tc>
-          <w:tcPr>
-            <w:tcW w:type="dxa" w:w="2736"/>
-          </w:tcPr>
-          <w:p>
-            <w:pPr>
-              <w:jc w:val="center"/>
-            </w:pPr>
-            <w:r>
-              <w:rPr>
-                <w:rFonts w:ascii="Aptos" w:hAnsi="Aptos"/>
-                <w:b w:val="0"/>
-                <w:sz w:val="20"/>
-              </w:rPr>
-              <w:t>FD 3,74</w:t>
-              <w:br/>
-              <w:t>(página 125)</w:t>
-            </w:r>
-          </w:p>
-        </w:tc>
-      </w:tr>
-      <w:tr>
-        <w:tc>
-          <w:tcPr>
-            <w:tcW w:type="dxa" w:w="2592"/>
-          </w:tcPr>
-          <w:p>
-            <w:pPr>
-              <w:jc w:val="center"/>
-            </w:pPr>
-            <w:r>
-              <w:rPr>
-                <w:rFonts w:ascii="Aptos" w:hAnsi="Aptos"/>
-                <w:b w:val="0"/>
-                <w:sz w:val="20"/>
-              </w:rPr>
-              <w:t>39,94-39,90</w:t>
-            </w:r>
-          </w:p>
-        </w:tc>
-        <w:tc>
-          <w:tcPr>
-            <w:tcW w:type="dxa" w:w="1584"/>
-          </w:tcPr>
-          <w:p>
-            <w:pPr>
-              <w:jc w:val="center"/>
-            </w:pPr>
-            <w:r>
-              <w:rPr>
-                <w:rFonts w:ascii="Aptos" w:hAnsi="Aptos"/>
-                <w:b w:val="0"/>
-                <w:sz w:val="20"/>
-              </w:rPr>
-              <w:t>ST 4.06</w:t>
-            </w:r>
-          </w:p>
-        </w:tc>
-        <w:tc>
-          <w:tcPr>
-            <w:tcW w:type="dxa" w:w="2736"/>
-          </w:tcPr>
-          <w:p>
-            <w:pPr>
-              <w:jc w:val="center"/>
-            </w:pPr>
-            <w:r>
-              <w:rPr>
-                <w:rFonts w:ascii="Aptos" w:hAnsi="Aptos"/>
-                <w:b w:val="0"/>
-                <w:sz w:val="20"/>
-              </w:rPr>
-              <w:t>70,36</w:t>
-              <w:br/>
-              <w:t>(página 233)</w:t>
-            </w:r>
-          </w:p>
-        </w:tc>
-        <w:tc>
-          <w:tcPr>
-            <w:tcW w:type="dxa" w:w="2736"/>
-          </w:tcPr>
-          <w:p>
-            <w:pPr>
-              <w:jc w:val="center"/>
-            </w:pPr>
-            <w:r>
-              <w:rPr>
-                <w:rFonts w:ascii="Aptos" w:hAnsi="Aptos"/>
-                <w:b w:val="0"/>
-                <w:sz w:val="20"/>
-              </w:rPr>
-              <w:t>FD 3,74</w:t>
-              <w:br/>
-              <w:t>(página 125)</w:t>
-            </w:r>
-          </w:p>
-        </w:tc>
-      </w:tr>
-      <w:tr>
-        <w:tc>
-          <w:tcPr>
-            <w:tcW w:type="dxa" w:w="2736"/>
-            <w:gridSpan w:val="4"/>
-            <w:shd w:fill="FFFFCC"/>
-          </w:tcPr>
-          <w:p>
-            <w:pPr>
-              <w:jc w:val="left"/>
-            </w:pPr>
-            <w:r>
-              <w:rPr>
-                <w:rFonts w:ascii="Aptos" w:hAnsi="Aptos"/>
-                <w:b w:val="0"/>
-                <w:sz w:val="20"/>
-              </w:rPr>
-              <w:t>VPE – 034, PISTA SENTIDO SUL (CRESCENTE)</w:t>
-            </w:r>
-          </w:p>
-        </w:tc>
-      </w:tr>
-      <w:tr>
-        <w:tc>
-          <w:tcPr>
-            <w:tcW w:type="dxa" w:w="2592"/>
-          </w:tcPr>
-          <w:p>
-            <w:pPr>
-              <w:jc w:val="center"/>
-            </w:pPr>
-            <w:r>
-              <w:rPr>
-                <w:rFonts w:ascii="Aptos" w:hAnsi="Aptos"/>
-                <w:b w:val="0"/>
-                <w:sz w:val="20"/>
-              </w:rPr>
-              <w:t>00,06-00,36</w:t>
-            </w:r>
-          </w:p>
-        </w:tc>
-        <w:tc>
-          <w:tcPr>
-            <w:tcW w:type="dxa" w:w="1584"/>
-          </w:tcPr>
-          <w:p>
-            <w:pPr>
-              <w:jc w:val="center"/>
-            </w:pPr>
-            <w:r>
-              <w:rPr>
-                <w:rFonts w:ascii="Aptos" w:hAnsi="Aptos"/>
-                <w:b w:val="0"/>
-                <w:sz w:val="20"/>
-              </w:rPr>
-              <w:t>ST 5.01</w:t>
-            </w:r>
-          </w:p>
-        </w:tc>
-        <w:tc>
-          <w:tcPr>
-            <w:tcW w:type="dxa" w:w="2736"/>
-          </w:tcPr>
-          <w:p>
-            <w:pPr>
-              <w:jc w:val="center"/>
-            </w:pPr>
-            <w:r>
-              <w:rPr>
-                <w:rFonts w:ascii="Aptos" w:hAnsi="Aptos"/>
-                <w:b w:val="0"/>
-                <w:sz w:val="20"/>
-              </w:rPr>
-              <w:t>58,46</w:t>
-              <w:br/>
-              <w:t>(página 250)</w:t>
-            </w:r>
-          </w:p>
-        </w:tc>
-        <w:tc>
-          <w:tcPr>
-            <w:tcW w:type="dxa" w:w="2736"/>
-          </w:tcPr>
-          <w:p>
-            <w:pPr>
-              <w:jc w:val="center"/>
-            </w:pPr>
-            <w:r>
-              <w:rPr>
-                <w:rFonts w:ascii="Aptos" w:hAnsi="Aptos"/>
-                <w:b w:val="0"/>
-                <w:sz w:val="20"/>
-              </w:rPr>
-              <w:t>FE 4,32</w:t>
-              <w:br/>
-              <w:t>(página 125)</w:t>
-            </w:r>
-          </w:p>
-        </w:tc>
-      </w:tr>
-      <w:tr>
-        <w:tc>
-          <w:tcPr>
-            <w:tcW w:type="dxa" w:w="2592"/>
-          </w:tcPr>
-          <w:p>
-            <w:pPr>
-              <w:jc w:val="center"/>
-            </w:pPr>
-            <w:r>
-              <w:rPr>
-                <w:rFonts w:ascii="Aptos" w:hAnsi="Aptos"/>
-                <w:b w:val="0"/>
-                <w:sz w:val="20"/>
-              </w:rPr>
-              <w:t>00,45-00,48</w:t>
-              <w:br/>
-              <w:t>(ROTATÓRIA)</w:t>
-            </w:r>
-          </w:p>
-        </w:tc>
-        <w:tc>
-          <w:tcPr>
-            <w:tcW w:type="dxa" w:w="1584"/>
-          </w:tcPr>
-          <w:p>
-            <w:pPr>
-              <w:jc w:val="center"/>
-            </w:pPr>
-            <w:r>
-              <w:rPr>
-                <w:rFonts w:ascii="Aptos" w:hAnsi="Aptos"/>
-                <w:b w:val="0"/>
-                <w:sz w:val="20"/>
-              </w:rPr>
-              <w:t>ST 5.01</w:t>
-            </w:r>
-          </w:p>
-        </w:tc>
-        <w:tc>
-          <w:tcPr>
-            <w:tcW w:type="dxa" w:w="2736"/>
-          </w:tcPr>
-          <w:p>
-            <w:pPr>
-              <w:jc w:val="center"/>
-            </w:pPr>
-            <w:r>
-              <w:rPr>
-                <w:rFonts w:ascii="Aptos" w:hAnsi="Aptos"/>
-                <w:b w:val="0"/>
-                <w:sz w:val="20"/>
-              </w:rPr>
-              <w:t>58,46</w:t>
-              <w:br/>
-              <w:t>(página 250)</w:t>
-            </w:r>
-          </w:p>
-        </w:tc>
-        <w:tc>
-          <w:tcPr>
-            <w:tcW w:type="dxa" w:w="2736"/>
-          </w:tcPr>
-          <w:p>
-            <w:pPr>
-              <w:jc w:val="center"/>
-            </w:pPr>
-            <w:r>
-              <w:rPr>
-                <w:rFonts w:ascii="Aptos" w:hAnsi="Aptos"/>
-                <w:b w:val="0"/>
-                <w:sz w:val="20"/>
-              </w:rPr>
-              <w:t>FE 4,32</w:t>
-              <w:br/>
-              <w:t>(página 125)</w:t>
-            </w:r>
-          </w:p>
-        </w:tc>
-      </w:tr>
-      <w:tr>
-        <w:tc>
-          <w:tcPr>
-            <w:tcW w:type="dxa" w:w="2592"/>
-          </w:tcPr>
-          <w:p>
-            <w:pPr>
-              <w:jc w:val="center"/>
-            </w:pPr>
-            <w:r>
-              <w:rPr>
-                <w:rFonts w:ascii="Aptos" w:hAnsi="Aptos"/>
-                <w:b w:val="0"/>
-                <w:sz w:val="20"/>
-              </w:rPr>
-              <w:t>00,52-00,56</w:t>
-            </w:r>
-          </w:p>
-        </w:tc>
-        <w:tc>
-          <w:tcPr>
-            <w:tcW w:type="dxa" w:w="1584"/>
-          </w:tcPr>
-          <w:p>
-            <w:pPr>
-              <w:jc w:val="center"/>
-            </w:pPr>
-            <w:r>
-              <w:rPr>
-                <w:rFonts w:ascii="Aptos" w:hAnsi="Aptos"/>
-                <w:b w:val="0"/>
-                <w:sz w:val="20"/>
-              </w:rPr>
-              <w:t>ST 5.01</w:t>
-            </w:r>
-          </w:p>
-        </w:tc>
-        <w:tc>
-          <w:tcPr>
-            <w:tcW w:type="dxa" w:w="2736"/>
-          </w:tcPr>
-          <w:p>
-            <w:pPr>
-              <w:jc w:val="center"/>
-            </w:pPr>
-            <w:r>
-              <w:rPr>
-                <w:rFonts w:ascii="Aptos" w:hAnsi="Aptos"/>
-                <w:b w:val="0"/>
-                <w:sz w:val="20"/>
-              </w:rPr>
-              <w:t>58,46</w:t>
-              <w:br/>
-              <w:t>(página 250)</w:t>
-            </w:r>
-          </w:p>
-        </w:tc>
-        <w:tc>
-          <w:tcPr>
-            <w:tcW w:type="dxa" w:w="2736"/>
-          </w:tcPr>
-          <w:p>
-            <w:pPr>
-              <w:jc w:val="center"/>
-            </w:pPr>
-            <w:r>
-              <w:rPr>
-                <w:rFonts w:ascii="Aptos" w:hAnsi="Aptos"/>
-                <w:b w:val="0"/>
-                <w:sz w:val="20"/>
-              </w:rPr>
-              <w:t>FE 4,32</w:t>
-              <w:br/>
-              <w:t>(página 125)</w:t>
-            </w:r>
-          </w:p>
-        </w:tc>
-      </w:tr>
-      <w:tr>
-        <w:tc>
-          <w:tcPr>
-            <w:tcW w:type="dxa" w:w="2592"/>
-          </w:tcPr>
-          <w:p>
-            <w:pPr>
-              <w:jc w:val="center"/>
-            </w:pPr>
-            <w:r>
-              <w:rPr>
-                <w:rFonts w:ascii="Aptos" w:hAnsi="Aptos"/>
-                <w:b w:val="0"/>
-                <w:sz w:val="20"/>
-              </w:rPr>
-              <w:t>00,58-00,62</w:t>
-            </w:r>
-          </w:p>
-        </w:tc>
-        <w:tc>
-          <w:tcPr>
-            <w:tcW w:type="dxa" w:w="1584"/>
-          </w:tcPr>
-          <w:p>
-            <w:pPr>
-              <w:jc w:val="center"/>
-            </w:pPr>
-            <w:r>
-              <w:rPr>
-                <w:rFonts w:ascii="Aptos" w:hAnsi="Aptos"/>
-                <w:b w:val="0"/>
-                <w:sz w:val="20"/>
-              </w:rPr>
-              <w:t>ST 5.01</w:t>
-            </w:r>
-          </w:p>
-        </w:tc>
-        <w:tc>
-          <w:tcPr>
-            <w:tcW w:type="dxa" w:w="2736"/>
-          </w:tcPr>
-          <w:p>
-            <w:pPr>
-              <w:jc w:val="center"/>
-            </w:pPr>
-            <w:r>
-              <w:rPr>
-                <w:rFonts w:ascii="Aptos" w:hAnsi="Aptos"/>
-                <w:b w:val="0"/>
-                <w:sz w:val="20"/>
-              </w:rPr>
-              <w:t>58,46</w:t>
-              <w:br/>
-              <w:t>(página 250)</w:t>
-            </w:r>
-          </w:p>
-        </w:tc>
-        <w:tc>
-          <w:tcPr>
-            <w:tcW w:type="dxa" w:w="2736"/>
-          </w:tcPr>
-          <w:p>
-            <w:pPr>
-              <w:jc w:val="center"/>
-            </w:pPr>
-            <w:r>
-              <w:rPr>
-                <w:rFonts w:ascii="Aptos" w:hAnsi="Aptos"/>
-                <w:b w:val="0"/>
-                <w:sz w:val="20"/>
-              </w:rPr>
-              <w:t>FE 4,32</w:t>
-              <w:br/>
-              <w:t>(página 125)</w:t>
-            </w:r>
-          </w:p>
-        </w:tc>
-      </w:tr>
-      <w:tr>
-        <w:tc>
-          <w:tcPr>
-            <w:tcW w:type="dxa" w:w="2592"/>
-          </w:tcPr>
-          <w:p>
-            <w:pPr>
-              <w:jc w:val="center"/>
-            </w:pPr>
-            <w:r>
-              <w:rPr>
-                <w:rFonts w:ascii="Aptos" w:hAnsi="Aptos"/>
-                <w:b w:val="0"/>
-                <w:sz w:val="20"/>
-              </w:rPr>
-              <w:t>00,68-00,86</w:t>
-            </w:r>
-          </w:p>
-        </w:tc>
-        <w:tc>
-          <w:tcPr>
-            <w:tcW w:type="dxa" w:w="1584"/>
-          </w:tcPr>
-          <w:p>
-            <w:pPr>
-              <w:jc w:val="center"/>
-            </w:pPr>
-            <w:r>
-              <w:rPr>
-                <w:rFonts w:ascii="Aptos" w:hAnsi="Aptos"/>
-                <w:b w:val="0"/>
-                <w:sz w:val="20"/>
-              </w:rPr>
-              <w:t>ST 5.01</w:t>
-            </w:r>
-          </w:p>
-        </w:tc>
-        <w:tc>
-          <w:tcPr>
-            <w:tcW w:type="dxa" w:w="2736"/>
-          </w:tcPr>
-          <w:p>
-            <w:pPr>
-              <w:jc w:val="center"/>
-            </w:pPr>
-            <w:r>
-              <w:rPr>
-                <w:rFonts w:ascii="Aptos" w:hAnsi="Aptos"/>
-                <w:b w:val="0"/>
-                <w:sz w:val="20"/>
-              </w:rPr>
-              <w:t>58,46</w:t>
-              <w:br/>
-              <w:t>(página 250)</w:t>
-            </w:r>
-          </w:p>
-        </w:tc>
-        <w:tc>
-          <w:tcPr>
-            <w:tcW w:type="dxa" w:w="2736"/>
-          </w:tcPr>
-          <w:p>
-            <w:pPr>
-              <w:jc w:val="center"/>
-            </w:pPr>
-            <w:r>
-              <w:rPr>
-                <w:rFonts w:ascii="Aptos" w:hAnsi="Aptos"/>
-                <w:b w:val="0"/>
-                <w:sz w:val="20"/>
-              </w:rPr>
-              <w:t>FE 4,32</w:t>
-              <w:br/>
-              <w:t>(página 125)</w:t>
-            </w:r>
-          </w:p>
-        </w:tc>
-      </w:tr>
-      <w:tr>
-        <w:tc>
-          <w:tcPr>
-            <w:tcW w:type="dxa" w:w="2592"/>
-          </w:tcPr>
-          <w:p>
-            <w:pPr>
-              <w:jc w:val="center"/>
-            </w:pPr>
-            <w:r>
-              <w:rPr>
-                <w:rFonts w:ascii="Aptos" w:hAnsi="Aptos"/>
-                <w:b w:val="0"/>
-                <w:sz w:val="20"/>
-              </w:rPr>
-              <w:t>01,56-01,58</w:t>
-            </w:r>
-          </w:p>
-        </w:tc>
-        <w:tc>
-          <w:tcPr>
-            <w:tcW w:type="dxa" w:w="1584"/>
-          </w:tcPr>
-          <w:p>
-            <w:pPr>
-              <w:jc w:val="center"/>
-            </w:pPr>
-            <w:r>
-              <w:rPr>
-                <w:rFonts w:ascii="Aptos" w:hAnsi="Aptos"/>
-                <w:b w:val="0"/>
-                <w:sz w:val="20"/>
-              </w:rPr>
-              <w:t>ST 5.02</w:t>
-            </w:r>
-          </w:p>
-        </w:tc>
-        <w:tc>
-          <w:tcPr>
-            <w:tcW w:type="dxa" w:w="2736"/>
-          </w:tcPr>
-          <w:p>
-            <w:pPr>
-              <w:jc w:val="center"/>
-            </w:pPr>
-            <w:r>
-              <w:rPr>
-                <w:rFonts w:ascii="Aptos" w:hAnsi="Aptos"/>
-                <w:b w:val="0"/>
-                <w:sz w:val="20"/>
-              </w:rPr>
-              <w:t>35,91</w:t>
-              <w:br/>
-              <w:t>(página 252)</w:t>
-            </w:r>
-          </w:p>
-        </w:tc>
-        <w:tc>
-          <w:tcPr>
-            <w:tcW w:type="dxa" w:w="2736"/>
-          </w:tcPr>
-          <w:p>
-            <w:pPr>
-              <w:jc w:val="center"/>
-            </w:pPr>
-            <w:r>
-              <w:rPr>
-                <w:rFonts w:ascii="Aptos" w:hAnsi="Aptos"/>
-                <w:b w:val="0"/>
-                <w:sz w:val="20"/>
-              </w:rPr>
-              <w:t>FE 4,86</w:t>
-              <w:br/>
-              <w:t>(página 125)</w:t>
-            </w:r>
-          </w:p>
-        </w:tc>
-      </w:tr>
-      <w:tr>
-        <w:tc>
-          <w:tcPr>
-            <w:tcW w:type="dxa" w:w="2592"/>
-          </w:tcPr>
-          <w:p>
-            <w:pPr>
-              <w:jc w:val="center"/>
-            </w:pPr>
-            <w:r>
-              <w:rPr>
-                <w:rFonts w:ascii="Aptos" w:hAnsi="Aptos"/>
-                <w:b w:val="0"/>
-                <w:sz w:val="20"/>
-              </w:rPr>
-              <w:t>01,76-01,78</w:t>
-            </w:r>
-          </w:p>
-        </w:tc>
-        <w:tc>
-          <w:tcPr>
-            <w:tcW w:type="dxa" w:w="1584"/>
-          </w:tcPr>
-          <w:p>
-            <w:pPr>
-              <w:jc w:val="center"/>
-            </w:pPr>
-            <w:r>
-              <w:rPr>
-                <w:rFonts w:ascii="Aptos" w:hAnsi="Aptos"/>
-                <w:b w:val="0"/>
-                <w:sz w:val="20"/>
-              </w:rPr>
-              <w:t>ST 5.02</w:t>
-            </w:r>
-          </w:p>
-        </w:tc>
-        <w:tc>
-          <w:tcPr>
-            <w:tcW w:type="dxa" w:w="2736"/>
-          </w:tcPr>
-          <w:p>
-            <w:pPr>
-              <w:jc w:val="center"/>
-            </w:pPr>
-            <w:r>
-              <w:rPr>
-                <w:rFonts w:ascii="Aptos" w:hAnsi="Aptos"/>
-                <w:b w:val="0"/>
-                <w:sz w:val="20"/>
-              </w:rPr>
-              <w:t>35,91</w:t>
-              <w:br/>
-              <w:t>(página 252)</w:t>
-            </w:r>
-          </w:p>
-        </w:tc>
-        <w:tc>
-          <w:tcPr>
-            <w:tcW w:type="dxa" w:w="2736"/>
-          </w:tcPr>
-          <w:p>
-            <w:pPr>
-              <w:jc w:val="center"/>
-            </w:pPr>
-            <w:r>
-              <w:rPr>
-                <w:rFonts w:ascii="Aptos" w:hAnsi="Aptos"/>
-                <w:b w:val="0"/>
-                <w:sz w:val="20"/>
-              </w:rPr>
-              <w:t>FE 4,86</w:t>
-              <w:br/>
-              <w:t>(página 125)</w:t>
-            </w:r>
-          </w:p>
-        </w:tc>
-      </w:tr>
-      <w:tr>
-        <w:tc>
-          <w:tcPr>
-            <w:tcW w:type="dxa" w:w="2592"/>
-          </w:tcPr>
-          <w:p>
-            <w:pPr>
-              <w:jc w:val="center"/>
-            </w:pPr>
-            <w:r>
-              <w:rPr>
-                <w:rFonts w:ascii="Aptos" w:hAnsi="Aptos"/>
-                <w:b w:val="0"/>
-                <w:sz w:val="20"/>
-              </w:rPr>
-              <w:t>02,04-02,12</w:t>
-            </w:r>
-          </w:p>
-        </w:tc>
-        <w:tc>
-          <w:tcPr>
-            <w:tcW w:type="dxa" w:w="1584"/>
-          </w:tcPr>
-          <w:p>
-            <w:pPr>
-              <w:jc w:val="center"/>
-            </w:pPr>
-            <w:r>
-              <w:rPr>
-                <w:rFonts w:ascii="Aptos" w:hAnsi="Aptos"/>
-                <w:b w:val="0"/>
-                <w:sz w:val="20"/>
-              </w:rPr>
-              <w:t>ST 5.03</w:t>
-            </w:r>
-          </w:p>
-        </w:tc>
-        <w:tc>
-          <w:tcPr>
-            <w:tcW w:type="dxa" w:w="2736"/>
-          </w:tcPr>
-          <w:p>
-            <w:pPr>
-              <w:jc w:val="center"/>
-            </w:pPr>
-            <w:r>
-              <w:rPr>
-                <w:rFonts w:ascii="Aptos" w:hAnsi="Aptos"/>
-                <w:b w:val="0"/>
-                <w:sz w:val="20"/>
-              </w:rPr>
-              <w:t>35,36</w:t>
-              <w:br/>
-              <w:t>(página 254)</w:t>
-            </w:r>
-          </w:p>
-        </w:tc>
-        <w:tc>
-          <w:tcPr>
-            <w:tcW w:type="dxa" w:w="2736"/>
-          </w:tcPr>
-          <w:p>
-            <w:pPr>
-              <w:jc w:val="center"/>
-            </w:pPr>
-            <w:r>
-              <w:rPr>
-                <w:rFonts w:ascii="Aptos" w:hAnsi="Aptos"/>
-                <w:b w:val="0"/>
-                <w:sz w:val="20"/>
-              </w:rPr>
-              <w:t>FD 4,23</w:t>
-              <w:br/>
-              <w:t>(página 125)</w:t>
-            </w:r>
-          </w:p>
-        </w:tc>
-      </w:tr>
-      <w:tr>
-        <w:tc>
-          <w:tcPr>
-            <w:tcW w:type="dxa" w:w="2736"/>
-            <w:gridSpan w:val="4"/>
-            <w:shd w:fill="FFFFCC"/>
-          </w:tcPr>
-          <w:p>
-            <w:pPr>
-              <w:jc w:val="left"/>
-            </w:pPr>
-            <w:r>
-              <w:rPr>
-                <w:rFonts w:ascii="Aptos" w:hAnsi="Aptos"/>
-                <w:b w:val="0"/>
-                <w:sz w:val="20"/>
-              </w:rPr>
-              <w:t>VPE - 034, PISTA SENTIDO NORTE (DECRESCENTE)</w:t>
-            </w:r>
-          </w:p>
-        </w:tc>
-      </w:tr>
-      <w:tr>
-        <w:tc>
-          <w:tcPr>
-            <w:tcW w:type="dxa" w:w="2592"/>
-          </w:tcPr>
-          <w:p>
-            <w:pPr>
-              <w:jc w:val="center"/>
-            </w:pPr>
-            <w:r>
-              <w:rPr>
-                <w:rFonts w:ascii="Aptos" w:hAnsi="Aptos"/>
-                <w:b w:val="0"/>
-                <w:sz w:val="20"/>
-              </w:rPr>
-              <w:t>02,78-02,72</w:t>
-            </w:r>
-          </w:p>
-        </w:tc>
-        <w:tc>
-          <w:tcPr>
-            <w:tcW w:type="dxa" w:w="1584"/>
-          </w:tcPr>
-          <w:p>
-            <w:pPr>
-              <w:jc w:val="center"/>
-            </w:pPr>
-            <w:r>
-              <w:rPr>
-                <w:rFonts w:ascii="Aptos" w:hAnsi="Aptos"/>
-                <w:b w:val="0"/>
-                <w:sz w:val="20"/>
-              </w:rPr>
-              <w:t>ST 5.11</w:t>
-            </w:r>
-          </w:p>
-        </w:tc>
-        <w:tc>
-          <w:tcPr>
-            <w:tcW w:type="dxa" w:w="2736"/>
-          </w:tcPr>
-          <w:p>
-            <w:pPr>
-              <w:jc w:val="center"/>
-            </w:pPr>
-            <w:r>
-              <w:rPr>
-                <w:rFonts w:ascii="Aptos" w:hAnsi="Aptos"/>
-                <w:b w:val="0"/>
-                <w:sz w:val="20"/>
-              </w:rPr>
-              <w:t>60,89</w:t>
-              <w:br/>
-              <w:t>(página 271)</w:t>
-            </w:r>
-          </w:p>
-        </w:tc>
-        <w:tc>
-          <w:tcPr>
-            <w:tcW w:type="dxa" w:w="2736"/>
-          </w:tcPr>
-          <w:p>
-            <w:pPr>
-              <w:jc w:val="center"/>
-            </w:pPr>
-            <w:r>
-              <w:rPr>
-                <w:rFonts w:ascii="Aptos" w:hAnsi="Aptos"/>
-                <w:b w:val="0"/>
-                <w:sz w:val="20"/>
-              </w:rPr>
-              <w:t>FE 4,23</w:t>
-              <w:br/>
-              <w:t>(página 125)</w:t>
-            </w:r>
-          </w:p>
-        </w:tc>
-      </w:tr>
-      <w:tr>
-        <w:tc>
-          <w:tcPr>
-            <w:tcW w:type="dxa" w:w="2592"/>
-          </w:tcPr>
-          <w:p>
-            <w:pPr>
-              <w:jc w:val="center"/>
-            </w:pPr>
-            <w:r>
-              <w:rPr>
-                <w:rFonts w:ascii="Aptos" w:hAnsi="Aptos"/>
-                <w:b w:val="0"/>
-                <w:sz w:val="20"/>
-              </w:rPr>
-              <w:t>02,16-02,08</w:t>
-            </w:r>
-          </w:p>
-        </w:tc>
-        <w:tc>
-          <w:tcPr>
-            <w:tcW w:type="dxa" w:w="1584"/>
-          </w:tcPr>
-          <w:p>
-            <w:pPr>
-              <w:jc w:val="center"/>
-            </w:pPr>
-            <w:r>
-              <w:rPr>
-                <w:rFonts w:ascii="Aptos" w:hAnsi="Aptos"/>
-                <w:b w:val="0"/>
-                <w:sz w:val="20"/>
-              </w:rPr>
-              <w:t>ST 5.11</w:t>
-            </w:r>
-          </w:p>
-        </w:tc>
-        <w:tc>
-          <w:tcPr>
-            <w:tcW w:type="dxa" w:w="2736"/>
-          </w:tcPr>
-          <w:p>
-            <w:pPr>
-              <w:jc w:val="center"/>
-            </w:pPr>
-            <w:r>
-              <w:rPr>
-                <w:rFonts w:ascii="Aptos" w:hAnsi="Aptos"/>
-                <w:b w:val="0"/>
-                <w:sz w:val="20"/>
-              </w:rPr>
-              <w:t>60,89</w:t>
-              <w:br/>
-              <w:t>(página 271)</w:t>
-            </w:r>
-          </w:p>
-        </w:tc>
-        <w:tc>
-          <w:tcPr>
-            <w:tcW w:type="dxa" w:w="2736"/>
-          </w:tcPr>
-          <w:p>
-            <w:pPr>
-              <w:jc w:val="center"/>
-            </w:pPr>
-            <w:r>
-              <w:rPr>
-                <w:rFonts w:ascii="Aptos" w:hAnsi="Aptos"/>
-                <w:b w:val="0"/>
-                <w:sz w:val="20"/>
-              </w:rPr>
-              <w:t>FE 4,23</w:t>
-              <w:br/>
-              <w:t>(página 125)</w:t>
-            </w:r>
-          </w:p>
-        </w:tc>
-      </w:tr>
-    </w:tbl>
-    <w:p/>
-    <w:p>
-      <w:pPr>
         <w:spacing w:after="120" w:line="276" w:lineRule="auto"/>
         <w:jc w:val="both"/>
       </w:pPr>
       <w:r>
         <w:rPr>
           <w:rFonts w:ascii="Aptos" w:hAnsi="Aptos"/>
+          <w:b w:val="0"/>
+          <w:i w:val="0"/>
           <w:sz w:val="22"/>
         </w:rPr>
         <w:t>Os trechos com Não Conformidades registradas no Quadro 1, a seguir, associadas aos respectivos subtrechos, foram avaliadas pelos valores do Índice de Gravidade Global (IGG) que ultrapassaram o limite máximo previsto ≥ 30, como também os valores do Índice Irregularidade Longitudinal (IRI) que ultrapassaram o limite máximo previsto ≥ 2,7 m/km constantes do Relatório Anual 01 de novembro/2025 elaborado pelo Verificador Independente.</w:t>
@@ -5259,6 +2711,8 @@
       <w:r>
         <w:rPr>
           <w:rFonts w:ascii="Aptos" w:hAnsi="Aptos"/>
+          <w:b w:val="0"/>
+          <w:i w:val="0"/>
           <w:sz w:val="22"/>
         </w:rPr>
         <w:t>A partir das vistorias de campo, e das avaliações das Não Conformidades registradas pelo Verificador Independente, foram consolidadas as informações no Quadro 2, a seguir, as Não Conformidades e Determinações/Recomendações expedidas pela Arpe.</w:t>
@@ -5448,7 +2902,7 @@
                 <w:b/>
                 <w:sz w:val="20"/>
               </w:rPr>
-              <w:t>IDENTIFICAÇÃO</w:t>
+              <w:t>CODIFICAÇÃO</w:t>
             </w:r>
           </w:p>
         </w:tc>
@@ -5566,14 +3020,14 @@
           <w:p>
             <w:pPr>
               <w:spacing w:before="0" w:after="0" w:line="240" w:lineRule="auto"/>
-              <w:jc w:val="left"/>
+              <w:jc w:val="center"/>
             </w:pPr>
             <w:r>
               <w:rPr>
                 <w:rFonts w:ascii="Aptos" w:hAnsi="Aptos"/>
                 <w:sz w:val="20"/>
               </w:rPr>
-              <w:t>Fotos 1.1, 1.2, 1.3, 1.4, 1.5, 1.6, 1.7, 1.8, 1.9 e 2.0</w:t>
+              <w:t>Fotos 1.1, 1.2, 1.3, 1.4, 1.5, 1.6, 1.7, 1.8, 1.9 e 02</w:t>
             </w:r>
           </w:p>
         </w:tc>
@@ -5685,39 +3139,6 @@
       </w:tr>
     </w:tbl>
     <w:p/>
-    <w:p>
-      <w:pPr>
-        <w:spacing w:after="120"/>
-        <w:jc w:val="center"/>
-      </w:pPr>
-      <w:r>
-        <w:rPr>
-          <w:rFonts w:ascii="Aptos" w:hAnsi="Aptos"/>
-          <w:b/>
-          <w:sz w:val="22"/>
-        </w:rPr>
-        <w:t>Quadro 3</w:t>
-      </w:r>
-      <w:r>
-        <w:rPr>
-          <w:rFonts w:ascii="Aptos" w:hAnsi="Aptos"/>
-          <w:sz w:val="22"/>
-        </w:rPr>
-        <w:t xml:space="preserve"> – Pontos de Atenção por Rodovia/Sentido</w:t>
-      </w:r>
-    </w:p>
-    <w:p>
-      <w:pPr>
-        <w:jc w:val="center"/>
-      </w:pPr>
-      <w:r>
-        <w:rPr>
-          <w:rFonts w:ascii="Aptos" w:hAnsi="Aptos"/>
-          <w:sz w:val="20"/>
-        </w:rPr>
-        <w:t>Nenhum registro encontrado.</w:t>
-      </w:r>
-    </w:p>
     <w:p/>
     <w:p/>
     <w:p/>
@@ -5901,412 +3322,6 @@
         <w:t>Recomenda-se, por fim, o encaminhamento deste Relatório de Fiscalização para que Suape, na qualidade de Gestor do Contrato e Regulador desse Sistema Viário, realize as providências cabíveis junto à Concessionária Rota do Atlântico com o objetivo de garantir a regularização das Não Conformidades pendentes apontadas por esta Agência de Regulação.</w:t>
       </w:r>
     </w:p>
-    <w:p>
-      <w:pPr>
-        <w:pStyle w:val="Heading3"/>
-        <w:pageBreakBefore/>
-        <w:spacing w:before="160" w:after="80"/>
-      </w:pPr>
-      <w:r>
-        <w:rPr>
-          <w:rFonts w:ascii="Aptos" w:hAnsi="Aptos"/>
-          <w:b/>
-          <w:color w:val="000000"/>
-          <w:sz w:val="24"/>
-        </w:rPr>
-        <w:t>APÊNDICE A – REGISTROS FOTOGRÁFICOS DAS NÃO CONFORMIDADES</w:t>
-      </w:r>
-    </w:p>
-    <w:tbl>
-      <w:tblPr>
-        <w:tblStyle w:val="TableGrid"/>
-        <w:tblW w:type="auto" w:w="0"/>
-        <w:jc w:val="center"/>
-        <w:tblLayout w:type="fixed"/>
-        <w:tblLook w:firstColumn="1" w:firstRow="1" w:lastColumn="0" w:lastRow="0" w:noHBand="0" w:noVBand="1" w:val="04A0"/>
-      </w:tblPr>
-      <w:tblGrid>
-        <w:gridCol w:w="5234"/>
-        <w:gridCol w:w="5234"/>
-      </w:tblGrid>
-      <w:tr>
-        <w:tc>
-          <w:tcPr>
-            <w:tcW w:type="dxa" w:w="10469"/>
-            <w:gridSpan w:val="2"/>
-          </w:tcPr>
-          <w:p>
-            <w:pPr>
-              <w:spacing w:before="120" w:after="120"/>
-              <w:jc w:val="center"/>
-            </w:pPr>
-            <w:r>
-              <w:rPr>
-                <w:rFonts w:ascii="Aptos" w:hAnsi="Aptos"/>
-                <w:b/>
-                <w:sz w:val="22"/>
-              </w:rPr>
-              <w:t>Terminal Rodoviário do Recife - TIP, Pista sentido Única</w:t>
-            </w:r>
-          </w:p>
-        </w:tc>
-      </w:tr>
-      <w:tr>
-        <w:tc>
-          <w:tcPr>
-            <w:tcW w:type="dxa" w:w="5234"/>
-          </w:tcPr>
-          <w:p>
-            <w:pPr>
-              <w:spacing w:before="80" w:after="80"/>
-              <w:ind w:left="0" w:firstLine="0"/>
-              <w:jc w:val="center"/>
-            </w:pPr>
-          </w:p>
-        </w:tc>
-        <w:tc>
-          <w:tcPr>
-            <w:tcW w:type="dxa" w:w="5234"/>
-          </w:tcPr>
-          <w:p>
-            <w:pPr>
-              <w:spacing w:before="80" w:after="80"/>
-              <w:ind w:left="0" w:firstLine="0"/>
-              <w:jc w:val="center"/>
-            </w:pPr>
-          </w:p>
-        </w:tc>
-      </w:tr>
-      <w:tr>
-        <w:tc>
-          <w:tcPr>
-            <w:tcW w:type="dxa" w:w="5234"/>
-          </w:tcPr>
-          <w:p>
-            <w:pPr>
-              <w:spacing w:before="80" w:after="80"/>
-              <w:ind w:left="0" w:firstLine="0"/>
-              <w:jc w:val="both"/>
-            </w:pPr>
-            <w:r>
-              <w:rPr>
-                <w:rFonts w:ascii="Aptos" w:hAnsi="Aptos"/>
-                <w:sz w:val="20"/>
-              </w:rPr>
-              <w:t>Foto 1.1 – Infiltração em coluna de sustentação do Terminal do recife, (08/06/2025).</w:t>
-            </w:r>
-          </w:p>
-        </w:tc>
-        <w:tc>
-          <w:tcPr>
-            <w:tcW w:type="dxa" w:w="5234"/>
-          </w:tcPr>
-          <w:p>
-            <w:pPr>
-              <w:spacing w:before="80" w:after="80"/>
-              <w:ind w:left="0" w:firstLine="0"/>
-              <w:jc w:val="both"/>
-            </w:pPr>
-            <w:r>
-              <w:rPr>
-                <w:rFonts w:ascii="Aptos" w:hAnsi="Aptos"/>
-                <w:sz w:val="20"/>
-              </w:rPr>
-              <w:t>Foto 1.2 – Infiltração em coluna de sustentação do Terminal do recife, (08/06/2025).</w:t>
-            </w:r>
-          </w:p>
-        </w:tc>
-      </w:tr>
-      <w:tr>
-        <w:tc>
-          <w:tcPr>
-            <w:tcW w:type="dxa" w:w="5234"/>
-          </w:tcPr>
-          <w:p>
-            <w:pPr>
-              <w:spacing w:before="80" w:after="80"/>
-              <w:ind w:left="0" w:firstLine="0"/>
-              <w:jc w:val="center"/>
-            </w:pPr>
-          </w:p>
-        </w:tc>
-        <w:tc>
-          <w:tcPr>
-            <w:tcW w:type="dxa" w:w="5234"/>
-          </w:tcPr>
-          <w:p>
-            <w:pPr>
-              <w:spacing w:before="80" w:after="80"/>
-              <w:ind w:left="0" w:firstLine="0"/>
-              <w:jc w:val="center"/>
-            </w:pPr>
-          </w:p>
-        </w:tc>
-      </w:tr>
-      <w:tr>
-        <w:tc>
-          <w:tcPr>
-            <w:tcW w:type="dxa" w:w="5234"/>
-          </w:tcPr>
-          <w:p>
-            <w:pPr>
-              <w:spacing w:before="80" w:after="80"/>
-              <w:ind w:left="0" w:firstLine="0"/>
-              <w:jc w:val="both"/>
-            </w:pPr>
-            <w:r>
-              <w:rPr>
-                <w:rFonts w:ascii="Aptos" w:hAnsi="Aptos"/>
-                <w:sz w:val="20"/>
-              </w:rPr>
-              <w:t>Foto 1.3 – Infiltração em coluna de sustentação do Terminal do recife, (08/06/2025).</w:t>
-            </w:r>
-          </w:p>
-        </w:tc>
-        <w:tc>
-          <w:tcPr>
-            <w:tcW w:type="dxa" w:w="5234"/>
-          </w:tcPr>
-          <w:p>
-            <w:pPr>
-              <w:spacing w:before="80" w:after="80"/>
-              <w:ind w:left="0" w:firstLine="0"/>
-              <w:jc w:val="both"/>
-            </w:pPr>
-            <w:r>
-              <w:rPr>
-                <w:rFonts w:ascii="Aptos" w:hAnsi="Aptos"/>
-                <w:sz w:val="20"/>
-              </w:rPr>
-              <w:t>Foto 1.4 – Infiltração em coluna de sustentação do Terminal do recife, (08/06/2025).</w:t>
-            </w:r>
-          </w:p>
-        </w:tc>
-      </w:tr>
-      <w:tr>
-        <w:tc>
-          <w:tcPr>
-            <w:tcW w:type="dxa" w:w="5234"/>
-          </w:tcPr>
-          <w:p>
-            <w:pPr>
-              <w:spacing w:before="80" w:after="80"/>
-              <w:ind w:left="0" w:firstLine="0"/>
-              <w:jc w:val="center"/>
-            </w:pPr>
-          </w:p>
-        </w:tc>
-        <w:tc>
-          <w:tcPr>
-            <w:tcW w:type="dxa" w:w="5234"/>
-          </w:tcPr>
-          <w:p>
-            <w:pPr>
-              <w:spacing w:before="80" w:after="80"/>
-              <w:ind w:left="0" w:firstLine="0"/>
-              <w:jc w:val="center"/>
-            </w:pPr>
-          </w:p>
-        </w:tc>
-      </w:tr>
-      <w:tr>
-        <w:tc>
-          <w:tcPr>
-            <w:tcW w:type="dxa" w:w="5234"/>
-          </w:tcPr>
-          <w:p>
-            <w:pPr>
-              <w:spacing w:before="80" w:after="80"/>
-              <w:ind w:left="0" w:firstLine="0"/>
-              <w:jc w:val="both"/>
-            </w:pPr>
-            <w:r>
-              <w:rPr>
-                <w:rFonts w:ascii="Aptos" w:hAnsi="Aptos"/>
-                <w:sz w:val="20"/>
-              </w:rPr>
-              <w:t>Foto 1.5 – Infiltração em coluna de sustentação do Terminal do recife, (08/06/2025).</w:t>
-            </w:r>
-          </w:p>
-        </w:tc>
-        <w:tc>
-          <w:tcPr>
-            <w:tcW w:type="dxa" w:w="5234"/>
-          </w:tcPr>
-          <w:p>
-            <w:pPr>
-              <w:spacing w:before="80" w:after="80"/>
-              <w:ind w:left="0" w:firstLine="0"/>
-              <w:jc w:val="both"/>
-            </w:pPr>
-            <w:r>
-              <w:rPr>
-                <w:rFonts w:ascii="Aptos" w:hAnsi="Aptos"/>
-                <w:sz w:val="20"/>
-              </w:rPr>
-              <w:t>Foto 1.6 – Infiltração em coluna de sustentação do Terminal do recife, (08/06/2025).</w:t>
-            </w:r>
-          </w:p>
-        </w:tc>
-      </w:tr>
-      <w:tr>
-        <w:tc>
-          <w:tcPr>
-            <w:tcW w:type="dxa" w:w="5234"/>
-          </w:tcPr>
-          <w:p>
-            <w:pPr>
-              <w:spacing w:before="80" w:after="80"/>
-              <w:ind w:left="0" w:firstLine="0"/>
-              <w:jc w:val="center"/>
-            </w:pPr>
-          </w:p>
-        </w:tc>
-        <w:tc>
-          <w:tcPr>
-            <w:tcW w:type="dxa" w:w="5234"/>
-          </w:tcPr>
-          <w:p>
-            <w:pPr>
-              <w:spacing w:before="80" w:after="80"/>
-              <w:ind w:left="0" w:firstLine="0"/>
-              <w:jc w:val="center"/>
-            </w:pPr>
-          </w:p>
-        </w:tc>
-      </w:tr>
-      <w:tr>
-        <w:tc>
-          <w:tcPr>
-            <w:tcW w:type="dxa" w:w="5234"/>
-          </w:tcPr>
-          <w:p>
-            <w:pPr>
-              <w:spacing w:before="80" w:after="80"/>
-              <w:ind w:left="0" w:firstLine="0"/>
-              <w:jc w:val="both"/>
-            </w:pPr>
-            <w:r>
-              <w:rPr>
-                <w:rFonts w:ascii="Aptos" w:hAnsi="Aptos"/>
-                <w:sz w:val="20"/>
-              </w:rPr>
-              <w:t>Foto 1.7 – Infiltração em coluna de sustentação do Terminal do recife, (08/06/2025).</w:t>
-            </w:r>
-          </w:p>
-        </w:tc>
-        <w:tc>
-          <w:tcPr>
-            <w:tcW w:type="dxa" w:w="5234"/>
-          </w:tcPr>
-          <w:p>
-            <w:pPr>
-              <w:spacing w:before="80" w:after="80"/>
-              <w:ind w:left="0" w:firstLine="0"/>
-              <w:jc w:val="both"/>
-            </w:pPr>
-            <w:r>
-              <w:rPr>
-                <w:rFonts w:ascii="Aptos" w:hAnsi="Aptos"/>
-                <w:sz w:val="20"/>
-              </w:rPr>
-              <w:t>Foto 1.8 – Infiltração em coluna de sustentação do Terminal do recife, (08/06/2025).</w:t>
-            </w:r>
-          </w:p>
-        </w:tc>
-      </w:tr>
-      <w:tr>
-        <w:tc>
-          <w:tcPr>
-            <w:tcW w:type="dxa" w:w="5234"/>
-          </w:tcPr>
-          <w:p>
-            <w:pPr>
-              <w:spacing w:before="80" w:after="80"/>
-              <w:ind w:left="0" w:firstLine="0"/>
-              <w:jc w:val="center"/>
-            </w:pPr>
-          </w:p>
-        </w:tc>
-        <w:tc>
-          <w:tcPr>
-            <w:tcW w:type="dxa" w:w="5234"/>
-          </w:tcPr>
-          <w:p>
-            <w:pPr>
-              <w:spacing w:before="80" w:after="80"/>
-              <w:ind w:left="0" w:firstLine="0"/>
-              <w:jc w:val="center"/>
-            </w:pPr>
-          </w:p>
-        </w:tc>
-      </w:tr>
-      <w:tr>
-        <w:tc>
-          <w:tcPr>
-            <w:tcW w:type="dxa" w:w="5234"/>
-          </w:tcPr>
-          <w:p>
-            <w:pPr>
-              <w:spacing w:before="80" w:after="80"/>
-              <w:ind w:left="0" w:firstLine="0"/>
-              <w:jc w:val="both"/>
-            </w:pPr>
-            <w:r>
-              <w:rPr>
-                <w:rFonts w:ascii="Aptos" w:hAnsi="Aptos"/>
-                <w:sz w:val="20"/>
-              </w:rPr>
-              <w:t>Foto 1.9 – Infiltração em coluna de sustentação do Terminal do recife, (08/06/2025).</w:t>
-            </w:r>
-          </w:p>
-        </w:tc>
-        <w:tc>
-          <w:tcPr>
-            <w:tcW w:type="dxa" w:w="5234"/>
-          </w:tcPr>
-          <w:p>
-            <w:pPr>
-              <w:spacing w:before="80" w:after="80"/>
-              <w:ind w:left="0" w:firstLine="0"/>
-              <w:jc w:val="both"/>
-            </w:pPr>
-            <w:r>
-              <w:rPr>
-                <w:rFonts w:ascii="Aptos" w:hAnsi="Aptos"/>
-                <w:sz w:val="20"/>
-              </w:rPr>
-              <w:t>Foto 2.0 – Infiltração em coluna de sustentação do Terminal do recife, (08/06/2025).</w:t>
-            </w:r>
-          </w:p>
-        </w:tc>
-      </w:tr>
-    </w:tbl>
-    <w:p>
-      <w:pPr>
-        <w:pStyle w:val="Heading3"/>
-        <w:pageBreakBefore/>
-        <w:spacing w:before="160" w:after="80"/>
-      </w:pPr>
-      <w:r>
-        <w:rPr>
-          <w:rFonts w:ascii="Aptos" w:hAnsi="Aptos"/>
-          <w:b/>
-          <w:color w:val="000000"/>
-          <w:sz w:val="24"/>
-        </w:rPr>
-        <w:t>APÊNDICE B – REGISTROS FOTOGRÁFICOS DAS PONTOS DE ATENÇÃO</w:t>
-      </w:r>
-    </w:p>
-    <w:p>
-      <w:r>
-        <w:rPr>
-          <w:rFonts w:ascii="Aptos" w:hAnsi="Aptos"/>
-          <w:sz w:val="22"/>
-        </w:rPr>
-        <w:t>Nenhum registro fotográfico de ponto de atenção cadastrado.</w:t>
-      </w:r>
-    </w:p>
     <w:p/>
     <w:p>
       <w:pPr>
@@ -6457,6 +3472,98 @@
         <w:t>Matrícula nº 209640/01</w:t>
       </w:r>
     </w:p>
+    <w:p>
+      <w:pPr>
+        <w:pStyle w:val="Heading3"/>
+        <w:pageBreakBefore/>
+        <w:spacing w:before="160" w:after="80"/>
+      </w:pPr>
+      <w:r>
+        <w:rPr>
+          <w:rFonts w:ascii="Aptos" w:hAnsi="Aptos"/>
+          <w:b/>
+          <w:color w:val="000000"/>
+          <w:sz w:val="24"/>
+        </w:rPr>
+        <w:t>APÊNDICE ÚNICO - MEMORIAL FOTOGRÁFICO - FISCALIZAÇÃO</w:t>
+      </w:r>
+    </w:p>
+    <w:tbl>
+      <w:tblPr>
+        <w:tblStyle w:val="TableGrid"/>
+        <w:tblW w:type="auto" w:w="0"/>
+        <w:jc w:val="center"/>
+        <w:tblLayout w:type="fixed"/>
+        <w:tblLook w:firstColumn="1" w:firstRow="1" w:lastColumn="0" w:lastRow="0" w:noHBand="0" w:noVBand="1" w:val="04A0"/>
+      </w:tblPr>
+      <w:tblGrid>
+        <w:gridCol w:w="5234"/>
+        <w:gridCol w:w="5234"/>
+      </w:tblGrid>
+      <w:tr>
+        <w:tc>
+          <w:tcPr>
+            <w:tcW w:type="dxa" w:w="5234"/>
+          </w:tcPr>
+          <w:p>
+            <w:pPr>
+              <w:spacing w:before="80" w:after="80"/>
+              <w:jc w:val="center"/>
+            </w:pPr>
+          </w:p>
+        </w:tc>
+        <w:tc>
+          <w:tcPr>
+            <w:tcW w:type="dxa" w:w="5234"/>
+          </w:tcPr>
+          <w:p>
+            <w:pPr>
+              <w:spacing w:before="80" w:after="80"/>
+              <w:jc w:val="center"/>
+            </w:pPr>
+          </w:p>
+        </w:tc>
+      </w:tr>
+      <w:tr>
+        <w:tc>
+          <w:tcPr>
+            <w:tcW w:type="dxa" w:w="5234"/>
+          </w:tcPr>
+          <w:p>
+            <w:pPr>
+              <w:spacing w:before="80" w:after="80"/>
+              <w:jc w:val="both"/>
+            </w:pPr>
+            <w:r>
+              <w:rPr>
+                <w:rFonts w:ascii="Aptos" w:hAnsi="Aptos"/>
+                <w:sz w:val="20"/>
+              </w:rPr>
+              <w:t>Foto 1.1 – CIMENTO NÃO POSICIONADO NA SACADA (xx/xx/xxxx).</w:t>
+            </w:r>
+          </w:p>
+        </w:tc>
+        <w:tc>
+          <w:tcPr>
+            <w:tcW w:type="dxa" w:w="5234"/>
+          </w:tcPr>
+          <w:p>
+            <w:pPr>
+              <w:spacing w:before="80" w:after="80"/>
+              <w:jc w:val="both"/>
+            </w:pPr>
+            <w:r>
+              <w:rPr>
+                <w:rFonts w:ascii="Aptos" w:hAnsi="Aptos"/>
+                <w:sz w:val="20"/>
+              </w:rPr>
+              <w:t>Foto 1.2 – CIMENTO NÃO POSICIONADO NA SACADA (xx/xx/xxxx).</w:t>
+            </w:r>
+          </w:p>
+        </w:tc>
+      </w:tr>
+    </w:tbl>
+    <w:p/>
     <w:sectPr>
       <w:pgSz w:w="11909" w:h="16834"/>
       <w:pgMar w:top="720" w:right="720" w:bottom="720" w:left="720" w:header="720" w:footer="720" w:gutter="0"/>

</xml_diff>